<commit_message>
feat: add register with google, email and password, jwt strategy and login and logout
</commit_message>
<xml_diff>
--- a/Задачи/Backend/Маршрутный лист.docx
+++ b/Задачи/Backend/Маршрутный лист.docx
@@ -69,10 +69,10 @@
                     <pic:cNvPicPr/>
                   </pic:nvPicPr>
                   <pic:blipFill>
-                    <a:blip r:embed="rId5">
+                    <a:blip r:embed="rId6">
                       <a:extLst>
                         <a:ext uri="{96DAC541-7B7A-43D3-8B79-37D633B846F1}">
-                          <asvg:svgBlip xmlns:asvg="http://schemas.microsoft.com/office/drawing/2016/SVG/main" r:embed="rId6"/>
+                          <asvg:svgBlip xmlns:asvg="http://schemas.microsoft.com/office/drawing/2016/SVG/main" r:embed="rId7"/>
                         </a:ext>
                       </a:extLst>
                     </a:blip>
@@ -153,10 +153,10 @@
                     <pic:cNvPicPr/>
                   </pic:nvPicPr>
                   <pic:blipFill>
-                    <a:blip r:embed="rId5">
+                    <a:blip r:embed="rId6">
                       <a:extLst>
                         <a:ext uri="{96DAC541-7B7A-43D3-8B79-37D633B846F1}">
-                          <asvg:svgBlip xmlns:asvg="http://schemas.microsoft.com/office/drawing/2016/SVG/main" r:embed="rId6"/>
+                          <asvg:svgBlip xmlns:asvg="http://schemas.microsoft.com/office/drawing/2016/SVG/main" r:embed="rId7"/>
                         </a:ext>
                       </a:extLst>
                     </a:blip>
@@ -226,10 +226,10 @@
                     <pic:cNvPicPr/>
                   </pic:nvPicPr>
                   <pic:blipFill>
-                    <a:blip r:embed="rId5">
+                    <a:blip r:embed="rId6">
                       <a:extLst>
                         <a:ext uri="{96DAC541-7B7A-43D3-8B79-37D633B846F1}">
-                          <asvg:svgBlip xmlns:asvg="http://schemas.microsoft.com/office/drawing/2016/SVG/main" r:embed="rId6"/>
+                          <asvg:svgBlip xmlns:asvg="http://schemas.microsoft.com/office/drawing/2016/SVG/main" r:embed="rId7"/>
                         </a:ext>
                       </a:extLst>
                     </a:blip>
@@ -328,10 +328,10 @@
                     <pic:cNvPicPr/>
                   </pic:nvPicPr>
                   <pic:blipFill>
-                    <a:blip r:embed="rId5">
+                    <a:blip r:embed="rId6">
                       <a:extLst>
                         <a:ext uri="{96DAC541-7B7A-43D3-8B79-37D633B846F1}">
-                          <asvg:svgBlip xmlns:asvg="http://schemas.microsoft.com/office/drawing/2016/SVG/main" r:embed="rId6"/>
+                          <asvg:svgBlip xmlns:asvg="http://schemas.microsoft.com/office/drawing/2016/SVG/main" r:embed="rId7"/>
                         </a:ext>
                       </a:extLst>
                     </a:blip>
@@ -423,10 +423,10 @@
                     <pic:cNvPicPr/>
                   </pic:nvPicPr>
                   <pic:blipFill>
-                    <a:blip r:embed="rId5">
+                    <a:blip r:embed="rId6">
                       <a:extLst>
                         <a:ext uri="{96DAC541-7B7A-43D3-8B79-37D633B846F1}">
-                          <asvg:svgBlip xmlns:asvg="http://schemas.microsoft.com/office/drawing/2016/SVG/main" r:embed="rId6"/>
+                          <asvg:svgBlip xmlns:asvg="http://schemas.microsoft.com/office/drawing/2016/SVG/main" r:embed="rId7"/>
                         </a:ext>
                       </a:extLst>
                     </a:blip>
@@ -496,10 +496,10 @@
                     <pic:cNvPicPr/>
                   </pic:nvPicPr>
                   <pic:blipFill>
-                    <a:blip r:embed="rId5">
+                    <a:blip r:embed="rId6">
                       <a:extLst>
                         <a:ext uri="{96DAC541-7B7A-43D3-8B79-37D633B846F1}">
-                          <asvg:svgBlip xmlns:asvg="http://schemas.microsoft.com/office/drawing/2016/SVG/main" r:embed="rId6"/>
+                          <asvg:svgBlip xmlns:asvg="http://schemas.microsoft.com/office/drawing/2016/SVG/main" r:embed="rId7"/>
                         </a:ext>
                       </a:extLst>
                     </a:blip>
@@ -536,6 +536,134 @@
       <w:pPr>
         <w:rPr>
           <w:rFonts w:ascii="Times New Roman" w:hAnsi="Times New Roman" w:cs="Times New Roman"/>
+          <w:sz w:val="28"/>
+          <w:szCs w:val="28"/>
+        </w:rPr>
+      </w:pPr>
+      <w:r>
+        <w:rPr>
+          <w:rFonts w:ascii="Times New Roman" w:hAnsi="Times New Roman" w:cs="Times New Roman"/>
+          <w:sz w:val="28"/>
+          <w:szCs w:val="28"/>
+        </w:rPr>
+        <w:t xml:space="preserve">Сделать уникальным </w:t>
+      </w:r>
+      <w:proofErr w:type="spellStart"/>
+      <w:r>
+        <w:rPr>
+          <w:rFonts w:ascii="Times New Roman" w:hAnsi="Times New Roman" w:cs="Times New Roman"/>
+          <w:sz w:val="28"/>
+          <w:szCs w:val="28"/>
+        </w:rPr>
+        <w:t>ключем</w:t>
+      </w:r>
+      <w:proofErr w:type="spellEnd"/>
+      <w:r>
+        <w:rPr>
+          <w:rFonts w:ascii="Times New Roman" w:hAnsi="Times New Roman" w:cs="Times New Roman"/>
+          <w:sz w:val="28"/>
+          <w:szCs w:val="28"/>
+        </w:rPr>
+        <w:t xml:space="preserve"> поля </w:t>
+      </w:r>
+      <w:r>
+        <w:rPr>
+          <w:rFonts w:ascii="Times New Roman" w:hAnsi="Times New Roman" w:cs="Times New Roman"/>
+          <w:sz w:val="28"/>
+          <w:szCs w:val="28"/>
+        </w:rPr>
+        <w:t>(</w:t>
+      </w:r>
+      <w:r>
+        <w:rPr>
+          <w:rFonts w:ascii="Times New Roman" w:hAnsi="Times New Roman" w:cs="Times New Roman"/>
+          <w:sz w:val="28"/>
+          <w:szCs w:val="28"/>
+          <w:lang w:val="en-US"/>
+        </w:rPr>
+        <w:t>user</w:t>
+      </w:r>
+      <w:r>
+        <w:rPr>
+          <w:rFonts w:ascii="Times New Roman" w:hAnsi="Times New Roman" w:cs="Times New Roman"/>
+          <w:sz w:val="28"/>
+          <w:szCs w:val="28"/>
+        </w:rPr>
+        <w:t>_</w:t>
+      </w:r>
+      <w:r>
+        <w:rPr>
+          <w:rFonts w:ascii="Times New Roman" w:hAnsi="Times New Roman" w:cs="Times New Roman"/>
+          <w:sz w:val="28"/>
+          <w:szCs w:val="28"/>
+          <w:lang w:val="en-US"/>
+        </w:rPr>
+        <w:t>id</w:t>
+      </w:r>
+      <w:r>
+        <w:rPr>
+          <w:rFonts w:ascii="Times New Roman" w:hAnsi="Times New Roman" w:cs="Times New Roman"/>
+          <w:sz w:val="28"/>
+          <w:szCs w:val="28"/>
+        </w:rPr>
+        <w:t xml:space="preserve"> </w:t>
+      </w:r>
+      <w:r>
+        <w:rPr>
+          <w:rFonts w:ascii="Times New Roman" w:hAnsi="Times New Roman" w:cs="Times New Roman"/>
+          <w:sz w:val="28"/>
+          <w:szCs w:val="28"/>
+          <w:lang w:val="en-US"/>
+        </w:rPr>
+        <w:t>token</w:t>
+      </w:r>
+      <w:r>
+        <w:rPr>
+          <w:rFonts w:ascii="Times New Roman" w:hAnsi="Times New Roman" w:cs="Times New Roman"/>
+          <w:sz w:val="28"/>
+          <w:szCs w:val="28"/>
+        </w:rPr>
+        <w:t>_</w:t>
+      </w:r>
+      <w:r>
+        <w:rPr>
+          <w:rFonts w:ascii="Times New Roman" w:hAnsi="Times New Roman" w:cs="Times New Roman"/>
+          <w:sz w:val="28"/>
+          <w:szCs w:val="28"/>
+          <w:lang w:val="en-US"/>
+        </w:rPr>
+        <w:t>hash</w:t>
+      </w:r>
+      <w:r>
+        <w:rPr>
+          <w:rFonts w:ascii="Times New Roman" w:hAnsi="Times New Roman" w:cs="Times New Roman"/>
+          <w:sz w:val="28"/>
+          <w:szCs w:val="28"/>
+        </w:rPr>
+        <w:t>)</w:t>
+      </w:r>
+    </w:p>
+    <w:p>
+      <w:pPr>
+        <w:rPr>
+          <w:rFonts w:ascii="Times New Roman" w:hAnsi="Times New Roman" w:cs="Times New Roman"/>
+          <w:sz w:val="28"/>
+          <w:szCs w:val="28"/>
+        </w:rPr>
+      </w:pPr>
+      <w:r>
+        <w:rPr>
+          <w:rFonts w:ascii="Times New Roman" w:hAnsi="Times New Roman" w:cs="Times New Roman"/>
+          <w:sz w:val="28"/>
+          <w:szCs w:val="28"/>
+        </w:rPr>
+        <w:t>Сделать пароль опциональным (под вопросом)</w:t>
+      </w:r>
+    </w:p>
+    <w:p>
+      <w:pPr>
+        <w:rPr>
+          <w:rFonts w:ascii="Times New Roman" w:hAnsi="Times New Roman" w:cs="Times New Roman"/>
           <w:b/>
           <w:bCs/>
           <w:sz w:val="28"/>
@@ -564,13 +692,15 @@
           <w:rFonts w:ascii="Times New Roman" w:hAnsi="Times New Roman" w:cs="Times New Roman"/>
           <w:sz w:val="28"/>
           <w:szCs w:val="28"/>
-        </w:rPr>
-      </w:pPr>
-      <w:r>
-        <w:rPr>
-          <w:rFonts w:ascii="Times New Roman" w:hAnsi="Times New Roman" w:cs="Times New Roman"/>
-          <w:sz w:val="28"/>
-          <w:szCs w:val="28"/>
+          <w:highlight w:val="yellow"/>
+        </w:rPr>
+      </w:pPr>
+      <w:r>
+        <w:rPr>
+          <w:rFonts w:ascii="Times New Roman" w:hAnsi="Times New Roman" w:cs="Times New Roman"/>
+          <w:sz w:val="28"/>
+          <w:szCs w:val="28"/>
+          <w:highlight w:val="yellow"/>
         </w:rPr>
         <w:t>Реализовать регистрацию (</w:t>
       </w:r>
@@ -580,6 +710,7 @@
           <w:rFonts w:ascii="Times New Roman" w:hAnsi="Times New Roman" w:cs="Times New Roman"/>
           <w:sz w:val="28"/>
           <w:szCs w:val="28"/>
+          <w:highlight w:val="yellow"/>
         </w:rPr>
         <w:t>hash</w:t>
       </w:r>
@@ -589,16 +720,9 @@
           <w:rFonts w:ascii="Times New Roman" w:hAnsi="Times New Roman" w:cs="Times New Roman"/>
           <w:sz w:val="28"/>
           <w:szCs w:val="28"/>
-        </w:rPr>
-        <w:t xml:space="preserve"> пароля</w:t>
-      </w:r>
-      <w:r>
-        <w:rPr>
-          <w:rFonts w:ascii="Times New Roman" w:hAnsi="Times New Roman" w:cs="Times New Roman"/>
-          <w:sz w:val="28"/>
-          <w:szCs w:val="28"/>
-        </w:rPr>
-        <w:t>)</w:t>
+          <w:highlight w:val="yellow"/>
+        </w:rPr>
+        <w:t xml:space="preserve"> пароля)</w:t>
       </w:r>
       <w:r>
         <w:rPr>
@@ -606,6 +730,7 @@
           <w:noProof/>
           <w:sz w:val="28"/>
           <w:szCs w:val="28"/>
+          <w:highlight w:val="yellow"/>
         </w:rPr>
         <w:t xml:space="preserve"> </w:t>
       </w:r>
@@ -615,6 +740,7 @@
           <w:noProof/>
           <w:sz w:val="28"/>
           <w:szCs w:val="28"/>
+          <w:highlight w:val="yellow"/>
         </w:rPr>
         <w:drawing>
           <wp:inline distT="0" distB="0" distL="0" distR="0" wp14:anchorId="60688EB2" wp14:editId="2637201A">
@@ -632,10 +758,10 @@
                     <pic:cNvPicPr/>
                   </pic:nvPicPr>
                   <pic:blipFill>
-                    <a:blip r:embed="rId5">
+                    <a:blip r:embed="rId6">
                       <a:extLst>
                         <a:ext uri="{96DAC541-7B7A-43D3-8B79-37D633B846F1}">
-                          <asvg:svgBlip xmlns:asvg="http://schemas.microsoft.com/office/drawing/2016/SVG/main" r:embed="rId6"/>
+                          <asvg:svgBlip xmlns:asvg="http://schemas.microsoft.com/office/drawing/2016/SVG/main" r:embed="rId7"/>
                         </a:ext>
                       </a:extLst>
                     </a:blip>
@@ -663,6 +789,7 @@
           <w:rFonts w:ascii="Times New Roman" w:hAnsi="Times New Roman" w:cs="Times New Roman"/>
           <w:sz w:val="28"/>
           <w:szCs w:val="28"/>
+          <w:highlight w:val="yellow"/>
         </w:rPr>
         <w:t xml:space="preserve"> </w:t>
       </w:r>
@@ -677,15 +804,67 @@
           <w:rFonts w:ascii="Times New Roman" w:hAnsi="Times New Roman" w:cs="Times New Roman"/>
           <w:sz w:val="28"/>
           <w:szCs w:val="28"/>
-        </w:rPr>
-      </w:pPr>
-      <w:r>
-        <w:rPr>
-          <w:rFonts w:ascii="Times New Roman" w:hAnsi="Times New Roman" w:cs="Times New Roman"/>
-          <w:sz w:val="28"/>
-          <w:szCs w:val="28"/>
+          <w:highlight w:val="yellow"/>
+        </w:rPr>
+      </w:pPr>
+      <w:r>
+        <w:rPr>
+          <w:rFonts w:ascii="Times New Roman" w:hAnsi="Times New Roman" w:cs="Times New Roman"/>
+          <w:sz w:val="28"/>
+          <w:szCs w:val="28"/>
+          <w:highlight w:val="yellow"/>
         </w:rPr>
         <w:t xml:space="preserve">Реализовать логин (access + refresh JWT) </w:t>
+      </w:r>
+      <w:r>
+        <w:rPr>
+          <w:rFonts w:ascii="Times New Roman" w:hAnsi="Times New Roman" w:cs="Times New Roman"/>
+          <w:noProof/>
+          <w:sz w:val="28"/>
+          <w:szCs w:val="28"/>
+          <w:highlight w:val="yellow"/>
+        </w:rPr>
+        <w:drawing>
+          <wp:inline distT="0" distB="0" distL="0" distR="0" wp14:anchorId="74C53F00" wp14:editId="4E0EE886">
+            <wp:extent cx="182880" cy="182880"/>
+            <wp:effectExtent l="0" t="0" r="7620" b="7620"/>
+            <wp:docPr id="113160929" name="Рисунок 1" descr="Значок &quot;Галочка&quot; контур"/>
+            <wp:cNvGraphicFramePr>
+              <a:graphicFrameLocks xmlns:a="http://schemas.openxmlformats.org/drawingml/2006/main" noChangeAspect="1"/>
+            </wp:cNvGraphicFramePr>
+            <a:graphic xmlns:a="http://schemas.openxmlformats.org/drawingml/2006/main">
+              <a:graphicData uri="http://schemas.openxmlformats.org/drawingml/2006/picture">
+                <pic:pic xmlns:pic="http://schemas.openxmlformats.org/drawingml/2006/picture">
+                  <pic:nvPicPr>
+                    <pic:cNvPr id="914769617" name="Рисунок 914769617" descr="Значок &quot;Галочка&quot; контур"/>
+                    <pic:cNvPicPr/>
+                  </pic:nvPicPr>
+                  <pic:blipFill>
+                    <a:blip r:embed="rId6">
+                      <a:extLst>
+                        <a:ext uri="{96DAC541-7B7A-43D3-8B79-37D633B846F1}">
+                          <asvg:svgBlip xmlns:asvg="http://schemas.microsoft.com/office/drawing/2016/SVG/main" r:embed="rId7"/>
+                        </a:ext>
+                      </a:extLst>
+                    </a:blip>
+                    <a:stretch>
+                      <a:fillRect/>
+                    </a:stretch>
+                  </pic:blipFill>
+                  <pic:spPr>
+                    <a:xfrm>
+                      <a:off x="0" y="0"/>
+                      <a:ext cx="182880" cy="182880"/>
+                    </a:xfrm>
+                    <a:prstGeom prst="rect">
+                      <a:avLst/>
+                    </a:prstGeom>
+                  </pic:spPr>
+                </pic:pic>
+              </a:graphicData>
+            </a:graphic>
+          </wp:inline>
+        </w:drawing>
       </w:r>
     </w:p>
     <w:p>
@@ -698,15 +877,67 @@
           <w:rFonts w:ascii="Times New Roman" w:hAnsi="Times New Roman" w:cs="Times New Roman"/>
           <w:sz w:val="28"/>
           <w:szCs w:val="28"/>
-        </w:rPr>
-      </w:pPr>
-      <w:r>
-        <w:rPr>
-          <w:rFonts w:ascii="Times New Roman" w:hAnsi="Times New Roman" w:cs="Times New Roman"/>
-          <w:sz w:val="28"/>
-          <w:szCs w:val="28"/>
+          <w:highlight w:val="yellow"/>
+        </w:rPr>
+      </w:pPr>
+      <w:r>
+        <w:rPr>
+          <w:rFonts w:ascii="Times New Roman" w:hAnsi="Times New Roman" w:cs="Times New Roman"/>
+          <w:sz w:val="28"/>
+          <w:szCs w:val="28"/>
+          <w:highlight w:val="yellow"/>
         </w:rPr>
         <w:t xml:space="preserve">Сохранение refresh токена в БД </w:t>
+      </w:r>
+      <w:r>
+        <w:rPr>
+          <w:rFonts w:ascii="Times New Roman" w:hAnsi="Times New Roman" w:cs="Times New Roman"/>
+          <w:noProof/>
+          <w:sz w:val="28"/>
+          <w:szCs w:val="28"/>
+          <w:highlight w:val="yellow"/>
+        </w:rPr>
+        <w:drawing>
+          <wp:inline distT="0" distB="0" distL="0" distR="0" wp14:anchorId="553270C4" wp14:editId="0B1CEA2B">
+            <wp:extent cx="182880" cy="182880"/>
+            <wp:effectExtent l="0" t="0" r="7620" b="7620"/>
+            <wp:docPr id="1654090596" name="Рисунок 1" descr="Значок &quot;Галочка&quot; контур"/>
+            <wp:cNvGraphicFramePr>
+              <a:graphicFrameLocks xmlns:a="http://schemas.openxmlformats.org/drawingml/2006/main" noChangeAspect="1"/>
+            </wp:cNvGraphicFramePr>
+            <a:graphic xmlns:a="http://schemas.openxmlformats.org/drawingml/2006/main">
+              <a:graphicData uri="http://schemas.openxmlformats.org/drawingml/2006/picture">
+                <pic:pic xmlns:pic="http://schemas.openxmlformats.org/drawingml/2006/picture">
+                  <pic:nvPicPr>
+                    <pic:cNvPr id="914769617" name="Рисунок 914769617" descr="Значок &quot;Галочка&quot; контур"/>
+                    <pic:cNvPicPr/>
+                  </pic:nvPicPr>
+                  <pic:blipFill>
+                    <a:blip r:embed="rId6">
+                      <a:extLst>
+                        <a:ext uri="{96DAC541-7B7A-43D3-8B79-37D633B846F1}">
+                          <asvg:svgBlip xmlns:asvg="http://schemas.microsoft.com/office/drawing/2016/SVG/main" r:embed="rId7"/>
+                        </a:ext>
+                      </a:extLst>
+                    </a:blip>
+                    <a:stretch>
+                      <a:fillRect/>
+                    </a:stretch>
+                  </pic:blipFill>
+                  <pic:spPr>
+                    <a:xfrm>
+                      <a:off x="0" y="0"/>
+                      <a:ext cx="182880" cy="182880"/>
+                    </a:xfrm>
+                    <a:prstGeom prst="rect">
+                      <a:avLst/>
+                    </a:prstGeom>
+                  </pic:spPr>
+                </pic:pic>
+              </a:graphicData>
+            </a:graphic>
+          </wp:inline>
+        </w:drawing>
       </w:r>
     </w:p>
     <w:p>
@@ -719,13 +950,15 @@
           <w:rFonts w:ascii="Times New Roman" w:hAnsi="Times New Roman" w:cs="Times New Roman"/>
           <w:sz w:val="28"/>
           <w:szCs w:val="28"/>
-        </w:rPr>
-      </w:pPr>
-      <w:r>
-        <w:rPr>
-          <w:rFonts w:ascii="Times New Roman" w:hAnsi="Times New Roman" w:cs="Times New Roman"/>
-          <w:sz w:val="28"/>
-          <w:szCs w:val="28"/>
+          <w:highlight w:val="yellow"/>
+        </w:rPr>
+      </w:pPr>
+      <w:r>
+        <w:rPr>
+          <w:rFonts w:ascii="Times New Roman" w:hAnsi="Times New Roman" w:cs="Times New Roman"/>
+          <w:sz w:val="28"/>
+          <w:szCs w:val="28"/>
+          <w:highlight w:val="yellow"/>
         </w:rPr>
         <w:t xml:space="preserve">Реализовать refresh </w:t>
       </w:r>
@@ -735,6 +968,7 @@
           <w:rFonts w:ascii="Times New Roman" w:hAnsi="Times New Roman" w:cs="Times New Roman"/>
           <w:sz w:val="28"/>
           <w:szCs w:val="28"/>
+          <w:highlight w:val="yellow"/>
         </w:rPr>
         <w:t>endpoint</w:t>
       </w:r>
@@ -744,6 +978,67 @@
           <w:rFonts w:ascii="Times New Roman" w:hAnsi="Times New Roman" w:cs="Times New Roman"/>
           <w:sz w:val="28"/>
           <w:szCs w:val="28"/>
+          <w:highlight w:val="yellow"/>
+          <w:lang w:val="en-US"/>
+        </w:rPr>
+        <w:t xml:space="preserve"> </w:t>
+      </w:r>
+      <w:r>
+        <w:rPr>
+          <w:rFonts w:ascii="Times New Roman" w:hAnsi="Times New Roman" w:cs="Times New Roman"/>
+          <w:noProof/>
+          <w:sz w:val="28"/>
+          <w:szCs w:val="28"/>
+          <w:highlight w:val="yellow"/>
+        </w:rPr>
+        <w:drawing>
+          <wp:inline distT="0" distB="0" distL="0" distR="0" wp14:anchorId="58074265" wp14:editId="298B0418">
+            <wp:extent cx="182880" cy="182880"/>
+            <wp:effectExtent l="0" t="0" r="7620" b="7620"/>
+            <wp:docPr id="199988068" name="Рисунок 1" descr="Значок &quot;Галочка&quot; контур"/>
+            <wp:cNvGraphicFramePr>
+              <a:graphicFrameLocks xmlns:a="http://schemas.openxmlformats.org/drawingml/2006/main" noChangeAspect="1"/>
+            </wp:cNvGraphicFramePr>
+            <a:graphic xmlns:a="http://schemas.openxmlformats.org/drawingml/2006/main">
+              <a:graphicData uri="http://schemas.openxmlformats.org/drawingml/2006/picture">
+                <pic:pic xmlns:pic="http://schemas.openxmlformats.org/drawingml/2006/picture">
+                  <pic:nvPicPr>
+                    <pic:cNvPr id="914769617" name="Рисунок 914769617" descr="Значок &quot;Галочка&quot; контур"/>
+                    <pic:cNvPicPr/>
+                  </pic:nvPicPr>
+                  <pic:blipFill>
+                    <a:blip r:embed="rId6">
+                      <a:extLst>
+                        <a:ext uri="{96DAC541-7B7A-43D3-8B79-37D633B846F1}">
+                          <asvg:svgBlip xmlns:asvg="http://schemas.microsoft.com/office/drawing/2016/SVG/main" r:embed="rId7"/>
+                        </a:ext>
+                      </a:extLst>
+                    </a:blip>
+                    <a:stretch>
+                      <a:fillRect/>
+                    </a:stretch>
+                  </pic:blipFill>
+                  <pic:spPr>
+                    <a:xfrm>
+                      <a:off x="0" y="0"/>
+                      <a:ext cx="182880" cy="182880"/>
+                    </a:xfrm>
+                    <a:prstGeom prst="rect">
+                      <a:avLst/>
+                    </a:prstGeom>
+                  </pic:spPr>
+                </pic:pic>
+              </a:graphicData>
+            </a:graphic>
+          </wp:inline>
+        </w:drawing>
+      </w:r>
+      <w:r>
+        <w:rPr>
+          <w:rFonts w:ascii="Times New Roman" w:hAnsi="Times New Roman" w:cs="Times New Roman"/>
+          <w:sz w:val="28"/>
+          <w:szCs w:val="28"/>
+          <w:highlight w:val="yellow"/>
         </w:rPr>
         <w:t xml:space="preserve"> </w:t>
       </w:r>
@@ -758,13 +1053,15 @@
           <w:rFonts w:ascii="Times New Roman" w:hAnsi="Times New Roman" w:cs="Times New Roman"/>
           <w:sz w:val="28"/>
           <w:szCs w:val="28"/>
-        </w:rPr>
-      </w:pPr>
-      <w:r>
-        <w:rPr>
-          <w:rFonts w:ascii="Times New Roman" w:hAnsi="Times New Roman" w:cs="Times New Roman"/>
-          <w:sz w:val="28"/>
-          <w:szCs w:val="28"/>
+          <w:highlight w:val="yellow"/>
+        </w:rPr>
+      </w:pPr>
+      <w:r>
+        <w:rPr>
+          <w:rFonts w:ascii="Times New Roman" w:hAnsi="Times New Roman" w:cs="Times New Roman"/>
+          <w:sz w:val="28"/>
+          <w:szCs w:val="28"/>
+          <w:highlight w:val="yellow"/>
         </w:rPr>
         <w:t xml:space="preserve">Реализовать </w:t>
       </w:r>
@@ -774,6 +1071,7 @@
           <w:rFonts w:ascii="Times New Roman" w:hAnsi="Times New Roman" w:cs="Times New Roman"/>
           <w:sz w:val="28"/>
           <w:szCs w:val="28"/>
+          <w:highlight w:val="yellow"/>
         </w:rPr>
         <w:t>logout</w:t>
       </w:r>
@@ -783,8 +1081,59 @@
           <w:rFonts w:ascii="Times New Roman" w:hAnsi="Times New Roman" w:cs="Times New Roman"/>
           <w:sz w:val="28"/>
           <w:szCs w:val="28"/>
+          <w:highlight w:val="yellow"/>
         </w:rPr>
         <w:t xml:space="preserve"> (удаление refresh токена) </w:t>
+      </w:r>
+      <w:r>
+        <w:rPr>
+          <w:rFonts w:ascii="Times New Roman" w:hAnsi="Times New Roman" w:cs="Times New Roman"/>
+          <w:noProof/>
+          <w:sz w:val="28"/>
+          <w:szCs w:val="28"/>
+          <w:highlight w:val="yellow"/>
+        </w:rPr>
+        <w:drawing>
+          <wp:inline distT="0" distB="0" distL="0" distR="0" wp14:anchorId="3DBAEE3C" wp14:editId="47523A28">
+            <wp:extent cx="182880" cy="182880"/>
+            <wp:effectExtent l="0" t="0" r="7620" b="7620"/>
+            <wp:docPr id="747574295" name="Рисунок 1" descr="Значок &quot;Галочка&quot; контур"/>
+            <wp:cNvGraphicFramePr>
+              <a:graphicFrameLocks xmlns:a="http://schemas.openxmlformats.org/drawingml/2006/main" noChangeAspect="1"/>
+            </wp:cNvGraphicFramePr>
+            <a:graphic xmlns:a="http://schemas.openxmlformats.org/drawingml/2006/main">
+              <a:graphicData uri="http://schemas.openxmlformats.org/drawingml/2006/picture">
+                <pic:pic xmlns:pic="http://schemas.openxmlformats.org/drawingml/2006/picture">
+                  <pic:nvPicPr>
+                    <pic:cNvPr id="914769617" name="Рисунок 914769617" descr="Значок &quot;Галочка&quot; контур"/>
+                    <pic:cNvPicPr/>
+                  </pic:nvPicPr>
+                  <pic:blipFill>
+                    <a:blip r:embed="rId6">
+                      <a:extLst>
+                        <a:ext uri="{96DAC541-7B7A-43D3-8B79-37D633B846F1}">
+                          <asvg:svgBlip xmlns:asvg="http://schemas.microsoft.com/office/drawing/2016/SVG/main" r:embed="rId7"/>
+                        </a:ext>
+                      </a:extLst>
+                    </a:blip>
+                    <a:stretch>
+                      <a:fillRect/>
+                    </a:stretch>
+                  </pic:blipFill>
+                  <pic:spPr>
+                    <a:xfrm>
+                      <a:off x="0" y="0"/>
+                      <a:ext cx="182880" cy="182880"/>
+                    </a:xfrm>
+                    <a:prstGeom prst="rect">
+                      <a:avLst/>
+                    </a:prstGeom>
+                  </pic:spPr>
+                </pic:pic>
+              </a:graphicData>
+            </a:graphic>
+          </wp:inline>
+        </w:drawing>
       </w:r>
     </w:p>
     <w:p>
@@ -797,13 +1146,15 @@
           <w:rFonts w:ascii="Times New Roman" w:hAnsi="Times New Roman" w:cs="Times New Roman"/>
           <w:sz w:val="28"/>
           <w:szCs w:val="28"/>
-        </w:rPr>
-      </w:pPr>
-      <w:r>
-        <w:rPr>
-          <w:rFonts w:ascii="Times New Roman" w:hAnsi="Times New Roman" w:cs="Times New Roman"/>
-          <w:sz w:val="28"/>
-          <w:szCs w:val="28"/>
+          <w:highlight w:val="yellow"/>
+        </w:rPr>
+      </w:pPr>
+      <w:r>
+        <w:rPr>
+          <w:rFonts w:ascii="Times New Roman" w:hAnsi="Times New Roman" w:cs="Times New Roman"/>
+          <w:sz w:val="28"/>
+          <w:szCs w:val="28"/>
+          <w:highlight w:val="yellow"/>
         </w:rPr>
         <w:t xml:space="preserve">Реализовать JWT guard (защита </w:t>
       </w:r>
@@ -813,6 +1164,7 @@
           <w:rFonts w:ascii="Times New Roman" w:hAnsi="Times New Roman" w:cs="Times New Roman"/>
           <w:sz w:val="28"/>
           <w:szCs w:val="28"/>
+          <w:highlight w:val="yellow"/>
         </w:rPr>
         <w:t>эндпоинтов</w:t>
       </w:r>
@@ -822,8 +1174,59 @@
           <w:rFonts w:ascii="Times New Roman" w:hAnsi="Times New Roman" w:cs="Times New Roman"/>
           <w:sz w:val="28"/>
           <w:szCs w:val="28"/>
+          <w:highlight w:val="yellow"/>
         </w:rPr>
         <w:t xml:space="preserve">) </w:t>
+      </w:r>
+      <w:r>
+        <w:rPr>
+          <w:rFonts w:ascii="Times New Roman" w:hAnsi="Times New Roman" w:cs="Times New Roman"/>
+          <w:noProof/>
+          <w:sz w:val="28"/>
+          <w:szCs w:val="28"/>
+          <w:highlight w:val="yellow"/>
+        </w:rPr>
+        <w:drawing>
+          <wp:inline distT="0" distB="0" distL="0" distR="0" wp14:anchorId="0837F8F7" wp14:editId="6656C816">
+            <wp:extent cx="182880" cy="182880"/>
+            <wp:effectExtent l="0" t="0" r="7620" b="7620"/>
+            <wp:docPr id="326022844" name="Рисунок 1" descr="Значок &quot;Галочка&quot; контур"/>
+            <wp:cNvGraphicFramePr>
+              <a:graphicFrameLocks xmlns:a="http://schemas.openxmlformats.org/drawingml/2006/main" noChangeAspect="1"/>
+            </wp:cNvGraphicFramePr>
+            <a:graphic xmlns:a="http://schemas.openxmlformats.org/drawingml/2006/main">
+              <a:graphicData uri="http://schemas.openxmlformats.org/drawingml/2006/picture">
+                <pic:pic xmlns:pic="http://schemas.openxmlformats.org/drawingml/2006/picture">
+                  <pic:nvPicPr>
+                    <pic:cNvPr id="914769617" name="Рисунок 914769617" descr="Значок &quot;Галочка&quot; контур"/>
+                    <pic:cNvPicPr/>
+                  </pic:nvPicPr>
+                  <pic:blipFill>
+                    <a:blip r:embed="rId6">
+                      <a:extLst>
+                        <a:ext uri="{96DAC541-7B7A-43D3-8B79-37D633B846F1}">
+                          <asvg:svgBlip xmlns:asvg="http://schemas.microsoft.com/office/drawing/2016/SVG/main" r:embed="rId7"/>
+                        </a:ext>
+                      </a:extLst>
+                    </a:blip>
+                    <a:stretch>
+                      <a:fillRect/>
+                    </a:stretch>
+                  </pic:blipFill>
+                  <pic:spPr>
+                    <a:xfrm>
+                      <a:off x="0" y="0"/>
+                      <a:ext cx="182880" cy="182880"/>
+                    </a:xfrm>
+                    <a:prstGeom prst="rect">
+                      <a:avLst/>
+                    </a:prstGeom>
+                  </pic:spPr>
+                </pic:pic>
+              </a:graphicData>
+            </a:graphic>
+          </wp:inline>
+        </w:drawing>
       </w:r>
     </w:p>
     <w:p>
@@ -1072,6 +1475,7 @@
           <w:sz w:val="28"/>
           <w:szCs w:val="28"/>
         </w:rPr>
+        <w:lastRenderedPageBreak/>
         <w:t>5. Категории подписок</w:t>
       </w:r>
     </w:p>
@@ -1135,7 +1539,6 @@
           <w:sz w:val="28"/>
           <w:szCs w:val="28"/>
         </w:rPr>
-        <w:lastRenderedPageBreak/>
         <w:t xml:space="preserve">Получение категорий подписки </w:t>
       </w:r>
     </w:p>
@@ -1694,6 +2097,7 @@
           <w:sz w:val="28"/>
           <w:szCs w:val="28"/>
         </w:rPr>
+        <w:lastRenderedPageBreak/>
         <w:t xml:space="preserve">Получение ближайших платежей </w:t>
       </w:r>
     </w:p>
@@ -1757,7 +2161,6 @@
           <w:sz w:val="28"/>
           <w:szCs w:val="28"/>
         </w:rPr>
-        <w:lastRenderedPageBreak/>
         <w:t>Проверка доступа к данным (</w:t>
       </w:r>
       <w:proofErr w:type="spellStart"/>
@@ -6116,4 +6519,16 @@
     </a:ext>
   </a:extLst>
 </a:theme>
+</file>
+
+<file path=customXml/item1.xml><?xml version="1.0" encoding="utf-8"?>
+<b:Sources xmlns:b="http://schemas.openxmlformats.org/officeDocument/2006/bibliography" xmlns="http://schemas.openxmlformats.org/officeDocument/2006/bibliography" SelectedStyle="\APASixthEditionOfficeOnline.xsl" StyleName="APA" Version="6"/>
+</file>
+
+<file path=customXml/itemProps1.xml><?xml version="1.0" encoding="utf-8"?>
+<ds:datastoreItem xmlns:ds="http://schemas.openxmlformats.org/officeDocument/2006/customXml" ds:itemID="{39460EBF-28FB-4B6B-BB51-85EB12C5AA32}">
+  <ds:schemaRefs>
+    <ds:schemaRef ds:uri="http://schemas.openxmlformats.org/officeDocument/2006/bibliography"/>
+  </ds:schemaRefs>
+</ds:datastoreItem>
 </file>
</xml_diff>

<commit_message>
feat: create payment service
</commit_message>
<xml_diff>
--- a/Задачи/Backend/Маршрутный лист.docx
+++ b/Задачи/Backend/Маршрутный лист.docx
@@ -282,27 +282,7 @@
           <w:szCs w:val="28"/>
           <w:highlight w:val="cyan"/>
         </w:rPr>
-        <w:t xml:space="preserve">Настроить </w:t>
-      </w:r>
-      <w:proofErr w:type="spellStart"/>
-      <w:r>
-        <w:rPr>
-          <w:rFonts w:ascii="Times New Roman" w:hAnsi="Times New Roman" w:cs="Times New Roman"/>
-          <w:sz w:val="28"/>
-          <w:szCs w:val="28"/>
-          <w:highlight w:val="cyan"/>
-        </w:rPr>
-        <w:t>Prisma</w:t>
-      </w:r>
-      <w:proofErr w:type="spellEnd"/>
-      <w:r>
-        <w:rPr>
-          <w:rFonts w:ascii="Times New Roman" w:hAnsi="Times New Roman" w:cs="Times New Roman"/>
-          <w:sz w:val="28"/>
-          <w:szCs w:val="28"/>
-          <w:highlight w:val="cyan"/>
-        </w:rPr>
-        <w:t xml:space="preserve"> </w:t>
+        <w:t xml:space="preserve">Настроить Prisma </w:t>
       </w:r>
       <w:r>
         <w:rPr>
@@ -375,29 +355,7 @@
           <w:szCs w:val="28"/>
           <w:highlight w:val="cyan"/>
         </w:rPr>
-        <w:t xml:space="preserve">Описать </w:t>
-      </w:r>
-      <w:proofErr w:type="spellStart"/>
-      <w:proofErr w:type="gramStart"/>
-      <w:r>
-        <w:rPr>
-          <w:rFonts w:ascii="Times New Roman" w:hAnsi="Times New Roman" w:cs="Times New Roman"/>
-          <w:sz w:val="28"/>
-          <w:szCs w:val="28"/>
-          <w:highlight w:val="cyan"/>
-        </w:rPr>
-        <w:t>schema.prisma</w:t>
-      </w:r>
-      <w:proofErr w:type="spellEnd"/>
-      <w:proofErr w:type="gramEnd"/>
-      <w:r>
-        <w:rPr>
-          <w:rFonts w:ascii="Times New Roman" w:hAnsi="Times New Roman" w:cs="Times New Roman"/>
-          <w:sz w:val="28"/>
-          <w:szCs w:val="28"/>
-          <w:highlight w:val="cyan"/>
-        </w:rPr>
-        <w:t xml:space="preserve"> </w:t>
+        <w:t xml:space="preserve">Описать schema.prisma </w:t>
       </w:r>
       <w:r>
         <w:rPr>
@@ -548,27 +506,7 @@
           <w:szCs w:val="28"/>
           <w:highlight w:val="cyan"/>
         </w:rPr>
-        <w:t xml:space="preserve">Сделать уникальным </w:t>
-      </w:r>
-      <w:proofErr w:type="spellStart"/>
-      <w:r>
-        <w:rPr>
-          <w:rFonts w:ascii="Times New Roman" w:hAnsi="Times New Roman" w:cs="Times New Roman"/>
-          <w:sz w:val="28"/>
-          <w:szCs w:val="28"/>
-          <w:highlight w:val="cyan"/>
-        </w:rPr>
-        <w:t>ключем</w:t>
-      </w:r>
-      <w:proofErr w:type="spellEnd"/>
-      <w:r>
-        <w:rPr>
-          <w:rFonts w:ascii="Times New Roman" w:hAnsi="Times New Roman" w:cs="Times New Roman"/>
-          <w:sz w:val="28"/>
-          <w:szCs w:val="28"/>
-          <w:highlight w:val="cyan"/>
-        </w:rPr>
-        <w:t xml:space="preserve"> поля (</w:t>
+        <w:t>Сделать уникальным ключем поля (</w:t>
       </w:r>
       <w:r>
         <w:rPr>
@@ -707,27 +645,7 @@
           <w:szCs w:val="28"/>
           <w:highlight w:val="yellow"/>
         </w:rPr>
-        <w:t>Реализовать регистрацию (</w:t>
-      </w:r>
-      <w:proofErr w:type="spellStart"/>
-      <w:r>
-        <w:rPr>
-          <w:rFonts w:ascii="Times New Roman" w:hAnsi="Times New Roman" w:cs="Times New Roman"/>
-          <w:sz w:val="28"/>
-          <w:szCs w:val="28"/>
-          <w:highlight w:val="yellow"/>
-        </w:rPr>
-        <w:t>hash</w:t>
-      </w:r>
-      <w:proofErr w:type="spellEnd"/>
-      <w:r>
-        <w:rPr>
-          <w:rFonts w:ascii="Times New Roman" w:hAnsi="Times New Roman" w:cs="Times New Roman"/>
-          <w:sz w:val="28"/>
-          <w:szCs w:val="28"/>
-          <w:highlight w:val="yellow"/>
-        </w:rPr>
-        <w:t xml:space="preserve"> пароля)</w:t>
+        <w:t>Реализовать регистрацию (hash пароля)</w:t>
       </w:r>
       <w:r>
         <w:rPr>
@@ -965,19 +883,8 @@
           <w:szCs w:val="28"/>
           <w:highlight w:val="yellow"/>
         </w:rPr>
-        <w:t xml:space="preserve">Реализовать refresh </w:t>
-      </w:r>
-      <w:proofErr w:type="spellStart"/>
-      <w:r>
-        <w:rPr>
-          <w:rFonts w:ascii="Times New Roman" w:hAnsi="Times New Roman" w:cs="Times New Roman"/>
-          <w:sz w:val="28"/>
-          <w:szCs w:val="28"/>
-          <w:highlight w:val="yellow"/>
-        </w:rPr>
-        <w:t>endpoint</w:t>
-      </w:r>
-      <w:proofErr w:type="spellEnd"/>
+        <w:t>Реализовать refresh endpoint</w:t>
+      </w:r>
       <w:r>
         <w:rPr>
           <w:rFonts w:ascii="Times New Roman" w:hAnsi="Times New Roman" w:cs="Times New Roman"/>
@@ -1068,27 +975,7 @@
           <w:szCs w:val="28"/>
           <w:highlight w:val="yellow"/>
         </w:rPr>
-        <w:t xml:space="preserve">Реализовать </w:t>
-      </w:r>
-      <w:proofErr w:type="spellStart"/>
-      <w:r>
-        <w:rPr>
-          <w:rFonts w:ascii="Times New Roman" w:hAnsi="Times New Roman" w:cs="Times New Roman"/>
-          <w:sz w:val="28"/>
-          <w:szCs w:val="28"/>
-          <w:highlight w:val="yellow"/>
-        </w:rPr>
-        <w:t>logout</w:t>
-      </w:r>
-      <w:proofErr w:type="spellEnd"/>
-      <w:r>
-        <w:rPr>
-          <w:rFonts w:ascii="Times New Roman" w:hAnsi="Times New Roman" w:cs="Times New Roman"/>
-          <w:sz w:val="28"/>
-          <w:szCs w:val="28"/>
-          <w:highlight w:val="yellow"/>
-        </w:rPr>
-        <w:t xml:space="preserve"> (удаление refresh токена) </w:t>
+        <w:t xml:space="preserve">Реализовать logout (удаление refresh токена) </w:t>
       </w:r>
       <w:r>
         <w:rPr>
@@ -1161,27 +1048,7 @@
           <w:szCs w:val="28"/>
           <w:highlight w:val="yellow"/>
         </w:rPr>
-        <w:t xml:space="preserve">Реализовать JWT guard (защита </w:t>
-      </w:r>
-      <w:proofErr w:type="spellStart"/>
-      <w:r>
-        <w:rPr>
-          <w:rFonts w:ascii="Times New Roman" w:hAnsi="Times New Roman" w:cs="Times New Roman"/>
-          <w:sz w:val="28"/>
-          <w:szCs w:val="28"/>
-          <w:highlight w:val="yellow"/>
-        </w:rPr>
-        <w:t>эндпоинтов</w:t>
-      </w:r>
-      <w:proofErr w:type="spellEnd"/>
-      <w:r>
-        <w:rPr>
-          <w:rFonts w:ascii="Times New Roman" w:hAnsi="Times New Roman" w:cs="Times New Roman"/>
-          <w:sz w:val="28"/>
-          <w:szCs w:val="28"/>
-          <w:highlight w:val="yellow"/>
-        </w:rPr>
-        <w:t xml:space="preserve">) </w:t>
+        <w:t xml:space="preserve">Реализовать JWT guard (защита эндпоинтов) </w:t>
       </w:r>
       <w:r>
         <w:rPr>
@@ -1513,25 +1380,7 @@
           <w:sz w:val="28"/>
           <w:szCs w:val="28"/>
         </w:rPr>
-        <w:t xml:space="preserve">Создание подписки (с расчётом </w:t>
-      </w:r>
-      <w:proofErr w:type="spellStart"/>
-      <w:r>
-        <w:rPr>
-          <w:rFonts w:ascii="Times New Roman" w:hAnsi="Times New Roman" w:cs="Times New Roman"/>
-          <w:sz w:val="28"/>
-          <w:szCs w:val="28"/>
-        </w:rPr>
-        <w:t>next_payment_at</w:t>
-      </w:r>
-      <w:proofErr w:type="spellEnd"/>
-      <w:r>
-        <w:rPr>
-          <w:rFonts w:ascii="Times New Roman" w:hAnsi="Times New Roman" w:cs="Times New Roman"/>
-          <w:sz w:val="28"/>
-          <w:szCs w:val="28"/>
-        </w:rPr>
-        <w:t xml:space="preserve">) </w:t>
+        <w:t xml:space="preserve">Создание подписки (с расчётом next_payment_at) </w:t>
       </w:r>
       <w:r>
         <w:rPr>
@@ -1910,6 +1759,56 @@
         </w:rPr>
         <w:t xml:space="preserve">Добавление категории к подписке </w:t>
       </w:r>
+      <w:r>
+        <w:rPr>
+          <w:rFonts w:ascii="Times New Roman" w:hAnsi="Times New Roman" w:cs="Times New Roman"/>
+          <w:noProof/>
+          <w:sz w:val="28"/>
+          <w:szCs w:val="28"/>
+          <w:highlight w:val="yellow"/>
+        </w:rPr>
+        <w:drawing>
+          <wp:inline distT="0" distB="0" distL="0" distR="0" wp14:anchorId="0741EA3B" wp14:editId="06C392D5">
+            <wp:extent cx="182880" cy="182880"/>
+            <wp:effectExtent l="0" t="0" r="7620" b="7620"/>
+            <wp:docPr id="1414579399" name="Рисунок 1" descr="Значок &quot;Галочка&quot; контур"/>
+            <wp:cNvGraphicFramePr>
+              <a:graphicFrameLocks xmlns:a="http://schemas.openxmlformats.org/drawingml/2006/main" noChangeAspect="1"/>
+            </wp:cNvGraphicFramePr>
+            <a:graphic xmlns:a="http://schemas.openxmlformats.org/drawingml/2006/main">
+              <a:graphicData uri="http://schemas.openxmlformats.org/drawingml/2006/picture">
+                <pic:pic xmlns:pic="http://schemas.openxmlformats.org/drawingml/2006/picture">
+                  <pic:nvPicPr>
+                    <pic:cNvPr id="914769617" name="Рисунок 914769617" descr="Значок &quot;Галочка&quot; контур"/>
+                    <pic:cNvPicPr/>
+                  </pic:nvPicPr>
+                  <pic:blipFill>
+                    <a:blip r:embed="rId6">
+                      <a:extLst>
+                        <a:ext uri="{96DAC541-7B7A-43D3-8B79-37D633B846F1}">
+                          <asvg:svgBlip xmlns:asvg="http://schemas.microsoft.com/office/drawing/2016/SVG/main" r:embed="rId7"/>
+                        </a:ext>
+                      </a:extLst>
+                    </a:blip>
+                    <a:stretch>
+                      <a:fillRect/>
+                    </a:stretch>
+                  </pic:blipFill>
+                  <pic:spPr>
+                    <a:xfrm>
+                      <a:off x="0" y="0"/>
+                      <a:ext cx="182880" cy="182880"/>
+                    </a:xfrm>
+                    <a:prstGeom prst="rect">
+                      <a:avLst/>
+                    </a:prstGeom>
+                  </pic:spPr>
+                </pic:pic>
+              </a:graphicData>
+            </a:graphic>
+          </wp:inline>
+        </w:drawing>
+      </w:r>
     </w:p>
     <w:p>
       <w:pPr>
@@ -1931,6 +1830,56 @@
         </w:rPr>
         <w:t xml:space="preserve">Удаление категории </w:t>
       </w:r>
+      <w:r>
+        <w:rPr>
+          <w:rFonts w:ascii="Times New Roman" w:hAnsi="Times New Roman" w:cs="Times New Roman"/>
+          <w:noProof/>
+          <w:sz w:val="28"/>
+          <w:szCs w:val="28"/>
+          <w:highlight w:val="yellow"/>
+        </w:rPr>
+        <w:drawing>
+          <wp:inline distT="0" distB="0" distL="0" distR="0" wp14:anchorId="40570577" wp14:editId="65798C6E">
+            <wp:extent cx="182880" cy="182880"/>
+            <wp:effectExtent l="0" t="0" r="7620" b="7620"/>
+            <wp:docPr id="213609674" name="Рисунок 1" descr="Значок &quot;Галочка&quot; контур"/>
+            <wp:cNvGraphicFramePr>
+              <a:graphicFrameLocks xmlns:a="http://schemas.openxmlformats.org/drawingml/2006/main" noChangeAspect="1"/>
+            </wp:cNvGraphicFramePr>
+            <a:graphic xmlns:a="http://schemas.openxmlformats.org/drawingml/2006/main">
+              <a:graphicData uri="http://schemas.openxmlformats.org/drawingml/2006/picture">
+                <pic:pic xmlns:pic="http://schemas.openxmlformats.org/drawingml/2006/picture">
+                  <pic:nvPicPr>
+                    <pic:cNvPr id="914769617" name="Рисунок 914769617" descr="Значок &quot;Галочка&quot; контур"/>
+                    <pic:cNvPicPr/>
+                  </pic:nvPicPr>
+                  <pic:blipFill>
+                    <a:blip r:embed="rId6">
+                      <a:extLst>
+                        <a:ext uri="{96DAC541-7B7A-43D3-8B79-37D633B846F1}">
+                          <asvg:svgBlip xmlns:asvg="http://schemas.microsoft.com/office/drawing/2016/SVG/main" r:embed="rId7"/>
+                        </a:ext>
+                      </a:extLst>
+                    </a:blip>
+                    <a:stretch>
+                      <a:fillRect/>
+                    </a:stretch>
+                  </pic:blipFill>
+                  <pic:spPr>
+                    <a:xfrm>
+                      <a:off x="0" y="0"/>
+                      <a:ext cx="182880" cy="182880"/>
+                    </a:xfrm>
+                    <a:prstGeom prst="rect">
+                      <a:avLst/>
+                    </a:prstGeom>
+                  </pic:spPr>
+                </pic:pic>
+              </a:graphicData>
+            </a:graphic>
+          </wp:inline>
+        </w:drawing>
+      </w:r>
     </w:p>
     <w:p>
       <w:pPr>
@@ -1952,6 +1901,56 @@
         </w:rPr>
         <w:t xml:space="preserve">Получение категорий подписки </w:t>
       </w:r>
+      <w:r>
+        <w:rPr>
+          <w:rFonts w:ascii="Times New Roman" w:hAnsi="Times New Roman" w:cs="Times New Roman"/>
+          <w:noProof/>
+          <w:sz w:val="28"/>
+          <w:szCs w:val="28"/>
+          <w:highlight w:val="yellow"/>
+        </w:rPr>
+        <w:drawing>
+          <wp:inline distT="0" distB="0" distL="0" distR="0" wp14:anchorId="664ED550" wp14:editId="795A3F64">
+            <wp:extent cx="182880" cy="182880"/>
+            <wp:effectExtent l="0" t="0" r="7620" b="7620"/>
+            <wp:docPr id="1652874002" name="Рисунок 1" descr="Значок &quot;Галочка&quot; контур"/>
+            <wp:cNvGraphicFramePr>
+              <a:graphicFrameLocks xmlns:a="http://schemas.openxmlformats.org/drawingml/2006/main" noChangeAspect="1"/>
+            </wp:cNvGraphicFramePr>
+            <a:graphic xmlns:a="http://schemas.openxmlformats.org/drawingml/2006/main">
+              <a:graphicData uri="http://schemas.openxmlformats.org/drawingml/2006/picture">
+                <pic:pic xmlns:pic="http://schemas.openxmlformats.org/drawingml/2006/picture">
+                  <pic:nvPicPr>
+                    <pic:cNvPr id="914769617" name="Рисунок 914769617" descr="Значок &quot;Галочка&quot; контур"/>
+                    <pic:cNvPicPr/>
+                  </pic:nvPicPr>
+                  <pic:blipFill>
+                    <a:blip r:embed="rId6">
+                      <a:extLst>
+                        <a:ext uri="{96DAC541-7B7A-43D3-8B79-37D633B846F1}">
+                          <asvg:svgBlip xmlns:asvg="http://schemas.microsoft.com/office/drawing/2016/SVG/main" r:embed="rId7"/>
+                        </a:ext>
+                      </a:extLst>
+                    </a:blip>
+                    <a:stretch>
+                      <a:fillRect/>
+                    </a:stretch>
+                  </pic:blipFill>
+                  <pic:spPr>
+                    <a:xfrm>
+                      <a:off x="0" y="0"/>
+                      <a:ext cx="182880" cy="182880"/>
+                    </a:xfrm>
+                    <a:prstGeom prst="rect">
+                      <a:avLst/>
+                    </a:prstGeom>
+                  </pic:spPr>
+                </pic:pic>
+              </a:graphicData>
+            </a:graphic>
+          </wp:inline>
+        </w:drawing>
+      </w:r>
     </w:p>
     <w:p>
       <w:pPr>
@@ -1994,6 +1993,56 @@
         </w:rPr>
         <w:t xml:space="preserve">Отметка подписки как оплаченной </w:t>
       </w:r>
+      <w:r>
+        <w:rPr>
+          <w:rFonts w:ascii="Times New Roman" w:hAnsi="Times New Roman" w:cs="Times New Roman"/>
+          <w:noProof/>
+          <w:sz w:val="28"/>
+          <w:szCs w:val="28"/>
+          <w:highlight w:val="yellow"/>
+        </w:rPr>
+        <w:drawing>
+          <wp:inline distT="0" distB="0" distL="0" distR="0" wp14:anchorId="298E61CF" wp14:editId="564B1CA3">
+            <wp:extent cx="182880" cy="182880"/>
+            <wp:effectExtent l="0" t="0" r="7620" b="7620"/>
+            <wp:docPr id="424236726" name="Рисунок 1" descr="Значок &quot;Галочка&quot; контур"/>
+            <wp:cNvGraphicFramePr>
+              <a:graphicFrameLocks xmlns:a="http://schemas.openxmlformats.org/drawingml/2006/main" noChangeAspect="1"/>
+            </wp:cNvGraphicFramePr>
+            <a:graphic xmlns:a="http://schemas.openxmlformats.org/drawingml/2006/main">
+              <a:graphicData uri="http://schemas.openxmlformats.org/drawingml/2006/picture">
+                <pic:pic xmlns:pic="http://schemas.openxmlformats.org/drawingml/2006/picture">
+                  <pic:nvPicPr>
+                    <pic:cNvPr id="914769617" name="Рисунок 914769617" descr="Значок &quot;Галочка&quot; контур"/>
+                    <pic:cNvPicPr/>
+                  </pic:nvPicPr>
+                  <pic:blipFill>
+                    <a:blip r:embed="rId6">
+                      <a:extLst>
+                        <a:ext uri="{96DAC541-7B7A-43D3-8B79-37D633B846F1}">
+                          <asvg:svgBlip xmlns:asvg="http://schemas.microsoft.com/office/drawing/2016/SVG/main" r:embed="rId7"/>
+                        </a:ext>
+                      </a:extLst>
+                    </a:blip>
+                    <a:stretch>
+                      <a:fillRect/>
+                    </a:stretch>
+                  </pic:blipFill>
+                  <pic:spPr>
+                    <a:xfrm>
+                      <a:off x="0" y="0"/>
+                      <a:ext cx="182880" cy="182880"/>
+                    </a:xfrm>
+                    <a:prstGeom prst="rect">
+                      <a:avLst/>
+                    </a:prstGeom>
+                  </pic:spPr>
+                </pic:pic>
+              </a:graphicData>
+            </a:graphic>
+          </wp:inline>
+        </w:drawing>
+      </w:r>
     </w:p>
     <w:p>
       <w:pPr>
@@ -2015,6 +2064,56 @@
         </w:rPr>
         <w:t xml:space="preserve">Создание записи о платеже </w:t>
       </w:r>
+      <w:r>
+        <w:rPr>
+          <w:rFonts w:ascii="Times New Roman" w:hAnsi="Times New Roman" w:cs="Times New Roman"/>
+          <w:noProof/>
+          <w:sz w:val="28"/>
+          <w:szCs w:val="28"/>
+          <w:highlight w:val="yellow"/>
+        </w:rPr>
+        <w:drawing>
+          <wp:inline distT="0" distB="0" distL="0" distR="0" wp14:anchorId="20A59DDD" wp14:editId="0CA5E062">
+            <wp:extent cx="182880" cy="182880"/>
+            <wp:effectExtent l="0" t="0" r="7620" b="7620"/>
+            <wp:docPr id="2518006" name="Рисунок 1" descr="Значок &quot;Галочка&quot; контур"/>
+            <wp:cNvGraphicFramePr>
+              <a:graphicFrameLocks xmlns:a="http://schemas.openxmlformats.org/drawingml/2006/main" noChangeAspect="1"/>
+            </wp:cNvGraphicFramePr>
+            <a:graphic xmlns:a="http://schemas.openxmlformats.org/drawingml/2006/main">
+              <a:graphicData uri="http://schemas.openxmlformats.org/drawingml/2006/picture">
+                <pic:pic xmlns:pic="http://schemas.openxmlformats.org/drawingml/2006/picture">
+                  <pic:nvPicPr>
+                    <pic:cNvPr id="914769617" name="Рисунок 914769617" descr="Значок &quot;Галочка&quot; контур"/>
+                    <pic:cNvPicPr/>
+                  </pic:nvPicPr>
+                  <pic:blipFill>
+                    <a:blip r:embed="rId6">
+                      <a:extLst>
+                        <a:ext uri="{96DAC541-7B7A-43D3-8B79-37D633B846F1}">
+                          <asvg:svgBlip xmlns:asvg="http://schemas.microsoft.com/office/drawing/2016/SVG/main" r:embed="rId7"/>
+                        </a:ext>
+                      </a:extLst>
+                    </a:blip>
+                    <a:stretch>
+                      <a:fillRect/>
+                    </a:stretch>
+                  </pic:blipFill>
+                  <pic:spPr>
+                    <a:xfrm>
+                      <a:off x="0" y="0"/>
+                      <a:ext cx="182880" cy="182880"/>
+                    </a:xfrm>
+                    <a:prstGeom prst="rect">
+                      <a:avLst/>
+                    </a:prstGeom>
+                  </pic:spPr>
+                </pic:pic>
+              </a:graphicData>
+            </a:graphic>
+          </wp:inline>
+        </w:drawing>
+      </w:r>
     </w:p>
     <w:p>
       <w:pPr>
@@ -2034,25 +2133,57 @@
           <w:sz w:val="28"/>
           <w:szCs w:val="28"/>
         </w:rPr>
-        <w:t xml:space="preserve">Обновление </w:t>
-      </w:r>
-      <w:proofErr w:type="spellStart"/>
-      <w:r>
-        <w:rPr>
-          <w:rFonts w:ascii="Times New Roman" w:hAnsi="Times New Roman" w:cs="Times New Roman"/>
-          <w:sz w:val="28"/>
-          <w:szCs w:val="28"/>
-        </w:rPr>
-        <w:t>next_payment_at</w:t>
-      </w:r>
-      <w:proofErr w:type="spellEnd"/>
-      <w:r>
-        <w:rPr>
-          <w:rFonts w:ascii="Times New Roman" w:hAnsi="Times New Roman" w:cs="Times New Roman"/>
-          <w:sz w:val="28"/>
-          <w:szCs w:val="28"/>
-        </w:rPr>
-        <w:t xml:space="preserve"> после оплаты </w:t>
+        <w:t xml:space="preserve">Обновление next_payment_at после оплаты </w:t>
+      </w:r>
+      <w:r>
+        <w:rPr>
+          <w:rFonts w:ascii="Times New Roman" w:hAnsi="Times New Roman" w:cs="Times New Roman"/>
+          <w:noProof/>
+          <w:sz w:val="28"/>
+          <w:szCs w:val="28"/>
+          <w:highlight w:val="yellow"/>
+        </w:rPr>
+        <w:drawing>
+          <wp:inline distT="0" distB="0" distL="0" distR="0" wp14:anchorId="75C9EFB6" wp14:editId="5EFE03AA">
+            <wp:extent cx="182880" cy="182880"/>
+            <wp:effectExtent l="0" t="0" r="7620" b="7620"/>
+            <wp:docPr id="4318118" name="Рисунок 1" descr="Значок &quot;Галочка&quot; контур"/>
+            <wp:cNvGraphicFramePr>
+              <a:graphicFrameLocks xmlns:a="http://schemas.openxmlformats.org/drawingml/2006/main" noChangeAspect="1"/>
+            </wp:cNvGraphicFramePr>
+            <a:graphic xmlns:a="http://schemas.openxmlformats.org/drawingml/2006/main">
+              <a:graphicData uri="http://schemas.openxmlformats.org/drawingml/2006/picture">
+                <pic:pic xmlns:pic="http://schemas.openxmlformats.org/drawingml/2006/picture">
+                  <pic:nvPicPr>
+                    <pic:cNvPr id="914769617" name="Рисунок 914769617" descr="Значок &quot;Галочка&quot; контур"/>
+                    <pic:cNvPicPr/>
+                  </pic:nvPicPr>
+                  <pic:blipFill>
+                    <a:blip r:embed="rId6">
+                      <a:extLst>
+                        <a:ext uri="{96DAC541-7B7A-43D3-8B79-37D633B846F1}">
+                          <asvg:svgBlip xmlns:asvg="http://schemas.microsoft.com/office/drawing/2016/SVG/main" r:embed="rId7"/>
+                        </a:ext>
+                      </a:extLst>
+                    </a:blip>
+                    <a:stretch>
+                      <a:fillRect/>
+                    </a:stretch>
+                  </pic:blipFill>
+                  <pic:spPr>
+                    <a:xfrm>
+                      <a:off x="0" y="0"/>
+                      <a:ext cx="182880" cy="182880"/>
+                    </a:xfrm>
+                    <a:prstGeom prst="rect">
+                      <a:avLst/>
+                    </a:prstGeom>
+                  </pic:spPr>
+                </pic:pic>
+              </a:graphicData>
+            </a:graphic>
+          </wp:inline>
+        </w:drawing>
       </w:r>
     </w:p>
     <w:p>
@@ -2063,6 +2194,7 @@
           <w:bCs/>
           <w:sz w:val="28"/>
           <w:szCs w:val="28"/>
+          <w:lang w:val="en-US"/>
         </w:rPr>
       </w:pPr>
       <w:r>
@@ -2220,25 +2352,7 @@
           <w:sz w:val="28"/>
           <w:szCs w:val="28"/>
         </w:rPr>
-        <w:t>Реализовать фоновую задачу проверки подписок (</w:t>
-      </w:r>
-      <w:proofErr w:type="spellStart"/>
-      <w:r>
-        <w:rPr>
-          <w:rFonts w:ascii="Times New Roman" w:hAnsi="Times New Roman" w:cs="Times New Roman"/>
-          <w:sz w:val="28"/>
-          <w:szCs w:val="28"/>
-        </w:rPr>
-        <w:t>cron</w:t>
-      </w:r>
-      <w:proofErr w:type="spellEnd"/>
-      <w:r>
-        <w:rPr>
-          <w:rFonts w:ascii="Times New Roman" w:hAnsi="Times New Roman" w:cs="Times New Roman"/>
-          <w:sz w:val="28"/>
-          <w:szCs w:val="28"/>
-        </w:rPr>
-        <w:t xml:space="preserve">) </w:t>
+        <w:t xml:space="preserve">Реализовать фоновую задачу проверки подписок (cron) </w:t>
       </w:r>
     </w:p>
     <w:p>
@@ -2364,25 +2478,7 @@
           <w:sz w:val="28"/>
           <w:szCs w:val="28"/>
         </w:rPr>
-        <w:t xml:space="preserve">Сортировка по </w:t>
-      </w:r>
-      <w:proofErr w:type="spellStart"/>
-      <w:r>
-        <w:rPr>
-          <w:rFonts w:ascii="Times New Roman" w:hAnsi="Times New Roman" w:cs="Times New Roman"/>
-          <w:sz w:val="28"/>
-          <w:szCs w:val="28"/>
-        </w:rPr>
-        <w:t>next_payment_at</w:t>
-      </w:r>
-      <w:proofErr w:type="spellEnd"/>
-      <w:r>
-        <w:rPr>
-          <w:rFonts w:ascii="Times New Roman" w:hAnsi="Times New Roman" w:cs="Times New Roman"/>
-          <w:sz w:val="28"/>
-          <w:szCs w:val="28"/>
-        </w:rPr>
-        <w:t xml:space="preserve"> </w:t>
+        <w:t xml:space="preserve">Сортировка по next_payment_at </w:t>
       </w:r>
     </w:p>
     <w:p>
@@ -2487,6 +2583,7 @@
           <w:sz w:val="28"/>
           <w:szCs w:val="28"/>
         </w:rPr>
+        <w:lastRenderedPageBreak/>
         <w:t xml:space="preserve">Расчёт расходов за год </w:t>
       </w:r>
     </w:p>
@@ -2508,7 +2605,6 @@
           <w:sz w:val="28"/>
           <w:szCs w:val="28"/>
         </w:rPr>
-        <w:lastRenderedPageBreak/>
         <w:t xml:space="preserve">Получение ближайших платежей </w:t>
       </w:r>
     </w:p>
@@ -2572,25 +2668,7 @@
           <w:sz w:val="28"/>
           <w:szCs w:val="28"/>
         </w:rPr>
-        <w:t>Проверка доступа к данным (</w:t>
-      </w:r>
-      <w:proofErr w:type="spellStart"/>
-      <w:r>
-        <w:rPr>
-          <w:rFonts w:ascii="Times New Roman" w:hAnsi="Times New Roman" w:cs="Times New Roman"/>
-          <w:sz w:val="28"/>
-          <w:szCs w:val="28"/>
-        </w:rPr>
-        <w:t>ownership</w:t>
-      </w:r>
-      <w:proofErr w:type="spellEnd"/>
-      <w:r>
-        <w:rPr>
-          <w:rFonts w:ascii="Times New Roman" w:hAnsi="Times New Roman" w:cs="Times New Roman"/>
-          <w:sz w:val="28"/>
-          <w:szCs w:val="28"/>
-        </w:rPr>
-        <w:t xml:space="preserve">) </w:t>
+        <w:t xml:space="preserve">Проверка доступа к данным (ownership) </w:t>
       </w:r>
     </w:p>
     <w:p>

</xml_diff>

<commit_message>
fix: add create notification in databse
</commit_message>
<xml_diff>
--- a/Задачи/Backend/Маршрутный лист.docx
+++ b/Задачи/Backend/Маршрутный лист.docx
@@ -282,7 +282,27 @@
           <w:szCs w:val="28"/>
           <w:highlight w:val="cyan"/>
         </w:rPr>
-        <w:t xml:space="preserve">Настроить Prisma </w:t>
+        <w:t xml:space="preserve">Настроить </w:t>
+      </w:r>
+      <w:proofErr w:type="spellStart"/>
+      <w:r>
+        <w:rPr>
+          <w:rFonts w:ascii="Times New Roman" w:hAnsi="Times New Roman" w:cs="Times New Roman"/>
+          <w:sz w:val="28"/>
+          <w:szCs w:val="28"/>
+          <w:highlight w:val="cyan"/>
+        </w:rPr>
+        <w:t>Prisma</w:t>
+      </w:r>
+      <w:proofErr w:type="spellEnd"/>
+      <w:r>
+        <w:rPr>
+          <w:rFonts w:ascii="Times New Roman" w:hAnsi="Times New Roman" w:cs="Times New Roman"/>
+          <w:sz w:val="28"/>
+          <w:szCs w:val="28"/>
+          <w:highlight w:val="cyan"/>
+        </w:rPr>
+        <w:t xml:space="preserve"> </w:t>
       </w:r>
       <w:r>
         <w:rPr>
@@ -355,7 +375,27 @@
           <w:szCs w:val="28"/>
           <w:highlight w:val="cyan"/>
         </w:rPr>
-        <w:t xml:space="preserve">Описать schema.prisma </w:t>
+        <w:t xml:space="preserve">Описать </w:t>
+      </w:r>
+      <w:proofErr w:type="spellStart"/>
+      <w:r>
+        <w:rPr>
+          <w:rFonts w:ascii="Times New Roman" w:hAnsi="Times New Roman" w:cs="Times New Roman"/>
+          <w:sz w:val="28"/>
+          <w:szCs w:val="28"/>
+          <w:highlight w:val="cyan"/>
+        </w:rPr>
+        <w:t>schema.prisma</w:t>
+      </w:r>
+      <w:proofErr w:type="spellEnd"/>
+      <w:r>
+        <w:rPr>
+          <w:rFonts w:ascii="Times New Roman" w:hAnsi="Times New Roman" w:cs="Times New Roman"/>
+          <w:sz w:val="28"/>
+          <w:szCs w:val="28"/>
+          <w:highlight w:val="cyan"/>
+        </w:rPr>
+        <w:t xml:space="preserve"> </w:t>
       </w:r>
       <w:r>
         <w:rPr>
@@ -506,7 +546,27 @@
           <w:szCs w:val="28"/>
           <w:highlight w:val="cyan"/>
         </w:rPr>
-        <w:t>Сделать уникальным ключем поля (</w:t>
+        <w:t xml:space="preserve">Сделать уникальным </w:t>
+      </w:r>
+      <w:proofErr w:type="spellStart"/>
+      <w:r>
+        <w:rPr>
+          <w:rFonts w:ascii="Times New Roman" w:hAnsi="Times New Roman" w:cs="Times New Roman"/>
+          <w:sz w:val="28"/>
+          <w:szCs w:val="28"/>
+          <w:highlight w:val="cyan"/>
+        </w:rPr>
+        <w:t>ключем</w:t>
+      </w:r>
+      <w:proofErr w:type="spellEnd"/>
+      <w:r>
+        <w:rPr>
+          <w:rFonts w:ascii="Times New Roman" w:hAnsi="Times New Roman" w:cs="Times New Roman"/>
+          <w:sz w:val="28"/>
+          <w:szCs w:val="28"/>
+          <w:highlight w:val="cyan"/>
+        </w:rPr>
+        <w:t xml:space="preserve"> поля (</w:t>
       </w:r>
       <w:r>
         <w:rPr>
@@ -645,7 +705,27 @@
           <w:szCs w:val="28"/>
           <w:highlight w:val="yellow"/>
         </w:rPr>
-        <w:t>Реализовать регистрацию (hash пароля)</w:t>
+        <w:t>Реализовать регистрацию (</w:t>
+      </w:r>
+      <w:proofErr w:type="spellStart"/>
+      <w:r>
+        <w:rPr>
+          <w:rFonts w:ascii="Times New Roman" w:hAnsi="Times New Roman" w:cs="Times New Roman"/>
+          <w:sz w:val="28"/>
+          <w:szCs w:val="28"/>
+          <w:highlight w:val="yellow"/>
+        </w:rPr>
+        <w:t>hash</w:t>
+      </w:r>
+      <w:proofErr w:type="spellEnd"/>
+      <w:r>
+        <w:rPr>
+          <w:rFonts w:ascii="Times New Roman" w:hAnsi="Times New Roman" w:cs="Times New Roman"/>
+          <w:sz w:val="28"/>
+          <w:szCs w:val="28"/>
+          <w:highlight w:val="yellow"/>
+        </w:rPr>
+        <w:t xml:space="preserve"> пароля)</w:t>
       </w:r>
       <w:r>
         <w:rPr>
@@ -883,8 +963,19 @@
           <w:szCs w:val="28"/>
           <w:highlight w:val="yellow"/>
         </w:rPr>
-        <w:t>Реализовать refresh endpoint</w:t>
-      </w:r>
+        <w:t xml:space="preserve">Реализовать refresh </w:t>
+      </w:r>
+      <w:proofErr w:type="spellStart"/>
+      <w:r>
+        <w:rPr>
+          <w:rFonts w:ascii="Times New Roman" w:hAnsi="Times New Roman" w:cs="Times New Roman"/>
+          <w:sz w:val="28"/>
+          <w:szCs w:val="28"/>
+          <w:highlight w:val="yellow"/>
+        </w:rPr>
+        <w:t>endpoint</w:t>
+      </w:r>
+      <w:proofErr w:type="spellEnd"/>
       <w:r>
         <w:rPr>
           <w:rFonts w:ascii="Times New Roman" w:hAnsi="Times New Roman" w:cs="Times New Roman"/>
@@ -975,7 +1066,27 @@
           <w:szCs w:val="28"/>
           <w:highlight w:val="yellow"/>
         </w:rPr>
-        <w:t xml:space="preserve">Реализовать logout (удаление refresh токена) </w:t>
+        <w:t xml:space="preserve">Реализовать </w:t>
+      </w:r>
+      <w:proofErr w:type="spellStart"/>
+      <w:r>
+        <w:rPr>
+          <w:rFonts w:ascii="Times New Roman" w:hAnsi="Times New Roman" w:cs="Times New Roman"/>
+          <w:sz w:val="28"/>
+          <w:szCs w:val="28"/>
+          <w:highlight w:val="yellow"/>
+        </w:rPr>
+        <w:t>logout</w:t>
+      </w:r>
+      <w:proofErr w:type="spellEnd"/>
+      <w:r>
+        <w:rPr>
+          <w:rFonts w:ascii="Times New Roman" w:hAnsi="Times New Roman" w:cs="Times New Roman"/>
+          <w:sz w:val="28"/>
+          <w:szCs w:val="28"/>
+          <w:highlight w:val="yellow"/>
+        </w:rPr>
+        <w:t xml:space="preserve"> (удаление refresh токена) </w:t>
       </w:r>
       <w:r>
         <w:rPr>
@@ -1048,7 +1159,27 @@
           <w:szCs w:val="28"/>
           <w:highlight w:val="yellow"/>
         </w:rPr>
-        <w:t xml:space="preserve">Реализовать JWT guard (защита эндпоинтов) </w:t>
+        <w:t xml:space="preserve">Реализовать JWT guard (защита </w:t>
+      </w:r>
+      <w:proofErr w:type="spellStart"/>
+      <w:r>
+        <w:rPr>
+          <w:rFonts w:ascii="Times New Roman" w:hAnsi="Times New Roman" w:cs="Times New Roman"/>
+          <w:sz w:val="28"/>
+          <w:szCs w:val="28"/>
+          <w:highlight w:val="yellow"/>
+        </w:rPr>
+        <w:t>эндпоинтов</w:t>
+      </w:r>
+      <w:proofErr w:type="spellEnd"/>
+      <w:r>
+        <w:rPr>
+          <w:rFonts w:ascii="Times New Roman" w:hAnsi="Times New Roman" w:cs="Times New Roman"/>
+          <w:sz w:val="28"/>
+          <w:szCs w:val="28"/>
+          <w:highlight w:val="yellow"/>
+        </w:rPr>
+        <w:t xml:space="preserve">) </w:t>
       </w:r>
       <w:r>
         <w:rPr>
@@ -1380,7 +1511,25 @@
           <w:sz w:val="28"/>
           <w:szCs w:val="28"/>
         </w:rPr>
-        <w:t xml:space="preserve">Создание подписки (с расчётом next_payment_at) </w:t>
+        <w:t xml:space="preserve">Создание подписки (с расчётом </w:t>
+      </w:r>
+      <w:proofErr w:type="spellStart"/>
+      <w:r>
+        <w:rPr>
+          <w:rFonts w:ascii="Times New Roman" w:hAnsi="Times New Roman" w:cs="Times New Roman"/>
+          <w:sz w:val="28"/>
+          <w:szCs w:val="28"/>
+        </w:rPr>
+        <w:t>next_payment_at</w:t>
+      </w:r>
+      <w:proofErr w:type="spellEnd"/>
+      <w:r>
+        <w:rPr>
+          <w:rFonts w:ascii="Times New Roman" w:hAnsi="Times New Roman" w:cs="Times New Roman"/>
+          <w:sz w:val="28"/>
+          <w:szCs w:val="28"/>
+        </w:rPr>
+        <w:t xml:space="preserve">) </w:t>
       </w:r>
       <w:r>
         <w:rPr>
@@ -2133,7 +2282,25 @@
           <w:sz w:val="28"/>
           <w:szCs w:val="28"/>
         </w:rPr>
-        <w:t xml:space="preserve">Обновление next_payment_at после оплаты </w:t>
+        <w:t xml:space="preserve">Обновление </w:t>
+      </w:r>
+      <w:proofErr w:type="spellStart"/>
+      <w:r>
+        <w:rPr>
+          <w:rFonts w:ascii="Times New Roman" w:hAnsi="Times New Roman" w:cs="Times New Roman"/>
+          <w:sz w:val="28"/>
+          <w:szCs w:val="28"/>
+        </w:rPr>
+        <w:t>next_payment_at</w:t>
+      </w:r>
+      <w:proofErr w:type="spellEnd"/>
+      <w:r>
+        <w:rPr>
+          <w:rFonts w:ascii="Times New Roman" w:hAnsi="Times New Roman" w:cs="Times New Roman"/>
+          <w:sz w:val="28"/>
+          <w:szCs w:val="28"/>
+        </w:rPr>
+        <w:t xml:space="preserve"> после оплаты </w:t>
       </w:r>
       <w:r>
         <w:rPr>
@@ -2228,6 +2395,56 @@
         </w:rPr>
         <w:t xml:space="preserve">Настроить Redis и BullMQ </w:t>
       </w:r>
+      <w:r>
+        <w:rPr>
+          <w:rFonts w:ascii="Times New Roman" w:hAnsi="Times New Roman" w:cs="Times New Roman"/>
+          <w:noProof/>
+          <w:sz w:val="28"/>
+          <w:szCs w:val="28"/>
+          <w:highlight w:val="yellow"/>
+        </w:rPr>
+        <w:drawing>
+          <wp:inline distT="0" distB="0" distL="0" distR="0" wp14:anchorId="013ECCEC" wp14:editId="61481CA6">
+            <wp:extent cx="182880" cy="182880"/>
+            <wp:effectExtent l="0" t="0" r="7620" b="7620"/>
+            <wp:docPr id="1735555235" name="Рисунок 1" descr="Значок &quot;Галочка&quot; контур"/>
+            <wp:cNvGraphicFramePr>
+              <a:graphicFrameLocks xmlns:a="http://schemas.openxmlformats.org/drawingml/2006/main" noChangeAspect="1"/>
+            </wp:cNvGraphicFramePr>
+            <a:graphic xmlns:a="http://schemas.openxmlformats.org/drawingml/2006/main">
+              <a:graphicData uri="http://schemas.openxmlformats.org/drawingml/2006/picture">
+                <pic:pic xmlns:pic="http://schemas.openxmlformats.org/drawingml/2006/picture">
+                  <pic:nvPicPr>
+                    <pic:cNvPr id="914769617" name="Рисунок 914769617" descr="Значок &quot;Галочка&quot; контур"/>
+                    <pic:cNvPicPr/>
+                  </pic:nvPicPr>
+                  <pic:blipFill>
+                    <a:blip r:embed="rId6">
+                      <a:extLst>
+                        <a:ext uri="{96DAC541-7B7A-43D3-8B79-37D633B846F1}">
+                          <asvg:svgBlip xmlns:asvg="http://schemas.microsoft.com/office/drawing/2016/SVG/main" r:embed="rId7"/>
+                        </a:ext>
+                      </a:extLst>
+                    </a:blip>
+                    <a:stretch>
+                      <a:fillRect/>
+                    </a:stretch>
+                  </pic:blipFill>
+                  <pic:spPr>
+                    <a:xfrm>
+                      <a:off x="0" y="0"/>
+                      <a:ext cx="182880" cy="182880"/>
+                    </a:xfrm>
+                    <a:prstGeom prst="rect">
+                      <a:avLst/>
+                    </a:prstGeom>
+                  </pic:spPr>
+                </pic:pic>
+              </a:graphicData>
+            </a:graphic>
+          </wp:inline>
+        </w:drawing>
+      </w:r>
     </w:p>
     <w:p>
       <w:pPr>
@@ -2352,7 +2569,75 @@
           <w:sz w:val="28"/>
           <w:szCs w:val="28"/>
         </w:rPr>
-        <w:t xml:space="preserve">Реализовать фоновую задачу проверки подписок (cron) </w:t>
+        <w:t>Реализовать фоновую задачу проверки подписок (</w:t>
+      </w:r>
+      <w:proofErr w:type="spellStart"/>
+      <w:r>
+        <w:rPr>
+          <w:rFonts w:ascii="Times New Roman" w:hAnsi="Times New Roman" w:cs="Times New Roman"/>
+          <w:sz w:val="28"/>
+          <w:szCs w:val="28"/>
+        </w:rPr>
+        <w:t>cron</w:t>
+      </w:r>
+      <w:proofErr w:type="spellEnd"/>
+      <w:r>
+        <w:rPr>
+          <w:rFonts w:ascii="Times New Roman" w:hAnsi="Times New Roman" w:cs="Times New Roman"/>
+          <w:sz w:val="28"/>
+          <w:szCs w:val="28"/>
+        </w:rPr>
+        <w:t xml:space="preserve">) </w:t>
+      </w:r>
+      <w:r>
+        <w:rPr>
+          <w:rFonts w:ascii="Times New Roman" w:hAnsi="Times New Roman" w:cs="Times New Roman"/>
+          <w:noProof/>
+          <w:sz w:val="28"/>
+          <w:szCs w:val="28"/>
+          <w:highlight w:val="yellow"/>
+        </w:rPr>
+        <w:drawing>
+          <wp:inline distT="0" distB="0" distL="0" distR="0" wp14:anchorId="2A5229AE" wp14:editId="2D15CD55">
+            <wp:extent cx="182880" cy="182880"/>
+            <wp:effectExtent l="0" t="0" r="7620" b="7620"/>
+            <wp:docPr id="484697239" name="Рисунок 1" descr="Значок &quot;Галочка&quot; контур"/>
+            <wp:cNvGraphicFramePr>
+              <a:graphicFrameLocks xmlns:a="http://schemas.openxmlformats.org/drawingml/2006/main" noChangeAspect="1"/>
+            </wp:cNvGraphicFramePr>
+            <a:graphic xmlns:a="http://schemas.openxmlformats.org/drawingml/2006/main">
+              <a:graphicData uri="http://schemas.openxmlformats.org/drawingml/2006/picture">
+                <pic:pic xmlns:pic="http://schemas.openxmlformats.org/drawingml/2006/picture">
+                  <pic:nvPicPr>
+                    <pic:cNvPr id="914769617" name="Рисунок 914769617" descr="Значок &quot;Галочка&quot; контур"/>
+                    <pic:cNvPicPr/>
+                  </pic:nvPicPr>
+                  <pic:blipFill>
+                    <a:blip r:embed="rId6">
+                      <a:extLst>
+                        <a:ext uri="{96DAC541-7B7A-43D3-8B79-37D633B846F1}">
+                          <asvg:svgBlip xmlns:asvg="http://schemas.microsoft.com/office/drawing/2016/SVG/main" r:embed="rId7"/>
+                        </a:ext>
+                      </a:extLst>
+                    </a:blip>
+                    <a:stretch>
+                      <a:fillRect/>
+                    </a:stretch>
+                  </pic:blipFill>
+                  <pic:spPr>
+                    <a:xfrm>
+                      <a:off x="0" y="0"/>
+                      <a:ext cx="182880" cy="182880"/>
+                    </a:xfrm>
+                    <a:prstGeom prst="rect">
+                      <a:avLst/>
+                    </a:prstGeom>
+                  </pic:spPr>
+                </pic:pic>
+              </a:graphicData>
+            </a:graphic>
+          </wp:inline>
+        </w:drawing>
       </w:r>
     </w:p>
     <w:p>
@@ -2478,7 +2763,25 @@
           <w:sz w:val="28"/>
           <w:szCs w:val="28"/>
         </w:rPr>
-        <w:t xml:space="preserve">Сортировка по next_payment_at </w:t>
+        <w:t xml:space="preserve">Сортировка по </w:t>
+      </w:r>
+      <w:proofErr w:type="spellStart"/>
+      <w:r>
+        <w:rPr>
+          <w:rFonts w:ascii="Times New Roman" w:hAnsi="Times New Roman" w:cs="Times New Roman"/>
+          <w:sz w:val="28"/>
+          <w:szCs w:val="28"/>
+        </w:rPr>
+        <w:t>next_payment_at</w:t>
+      </w:r>
+      <w:proofErr w:type="spellEnd"/>
+      <w:r>
+        <w:rPr>
+          <w:rFonts w:ascii="Times New Roman" w:hAnsi="Times New Roman" w:cs="Times New Roman"/>
+          <w:sz w:val="28"/>
+          <w:szCs w:val="28"/>
+        </w:rPr>
+        <w:t xml:space="preserve"> </w:t>
       </w:r>
     </w:p>
     <w:p>
@@ -2668,7 +2971,25 @@
           <w:sz w:val="28"/>
           <w:szCs w:val="28"/>
         </w:rPr>
-        <w:t xml:space="preserve">Проверка доступа к данным (ownership) </w:t>
+        <w:t>Проверка доступа к данным (</w:t>
+      </w:r>
+      <w:proofErr w:type="spellStart"/>
+      <w:r>
+        <w:rPr>
+          <w:rFonts w:ascii="Times New Roman" w:hAnsi="Times New Roman" w:cs="Times New Roman"/>
+          <w:sz w:val="28"/>
+          <w:szCs w:val="28"/>
+        </w:rPr>
+        <w:t>ownership</w:t>
+      </w:r>
+      <w:proofErr w:type="spellEnd"/>
+      <w:r>
+        <w:rPr>
+          <w:rFonts w:ascii="Times New Roman" w:hAnsi="Times New Roman" w:cs="Times New Roman"/>
+          <w:sz w:val="28"/>
+          <w:szCs w:val="28"/>
+        </w:rPr>
+        <w:t xml:space="preserve">) </w:t>
       </w:r>
     </w:p>
     <w:p>

</xml_diff>

<commit_message>
fix: over module notification
</commit_message>
<xml_diff>
--- a/Задачи/Backend/Маршрутный лист.docx
+++ b/Задачи/Backend/Маршрутный лист.docx
@@ -378,6 +378,7 @@
         <w:t xml:space="preserve">Описать </w:t>
       </w:r>
       <w:proofErr w:type="spellStart"/>
+      <w:proofErr w:type="gramStart"/>
       <w:r>
         <w:rPr>
           <w:rFonts w:ascii="Times New Roman" w:hAnsi="Times New Roman" w:cs="Times New Roman"/>
@@ -388,6 +389,7 @@
         <w:t>schema.prisma</w:t>
       </w:r>
       <w:proofErr w:type="spellEnd"/>
+      <w:proofErr w:type="gramEnd"/>
       <w:r>
         <w:rPr>
           <w:rFonts w:ascii="Times New Roman" w:hAnsi="Times New Roman" w:cs="Times New Roman"/>
@@ -2466,6 +2468,56 @@
         </w:rPr>
         <w:t xml:space="preserve">Реализовать очередь уведомлений </w:t>
       </w:r>
+      <w:r>
+        <w:rPr>
+          <w:rFonts w:ascii="Times New Roman" w:hAnsi="Times New Roman" w:cs="Times New Roman"/>
+          <w:noProof/>
+          <w:sz w:val="28"/>
+          <w:szCs w:val="28"/>
+          <w:highlight w:val="yellow"/>
+        </w:rPr>
+        <w:drawing>
+          <wp:inline distT="0" distB="0" distL="0" distR="0" wp14:anchorId="39177C02" wp14:editId="54FD36C3">
+            <wp:extent cx="182880" cy="182880"/>
+            <wp:effectExtent l="0" t="0" r="7620" b="7620"/>
+            <wp:docPr id="615868852" name="Рисунок 1" descr="Значок &quot;Галочка&quot; контур"/>
+            <wp:cNvGraphicFramePr>
+              <a:graphicFrameLocks xmlns:a="http://schemas.openxmlformats.org/drawingml/2006/main" noChangeAspect="1"/>
+            </wp:cNvGraphicFramePr>
+            <a:graphic xmlns:a="http://schemas.openxmlformats.org/drawingml/2006/main">
+              <a:graphicData uri="http://schemas.openxmlformats.org/drawingml/2006/picture">
+                <pic:pic xmlns:pic="http://schemas.openxmlformats.org/drawingml/2006/picture">
+                  <pic:nvPicPr>
+                    <pic:cNvPr id="914769617" name="Рисунок 914769617" descr="Значок &quot;Галочка&quot; контур"/>
+                    <pic:cNvPicPr/>
+                  </pic:nvPicPr>
+                  <pic:blipFill>
+                    <a:blip r:embed="rId6">
+                      <a:extLst>
+                        <a:ext uri="{96DAC541-7B7A-43D3-8B79-37D633B846F1}">
+                          <asvg:svgBlip xmlns:asvg="http://schemas.microsoft.com/office/drawing/2016/SVG/main" r:embed="rId7"/>
+                        </a:ext>
+                      </a:extLst>
+                    </a:blip>
+                    <a:stretch>
+                      <a:fillRect/>
+                    </a:stretch>
+                  </pic:blipFill>
+                  <pic:spPr>
+                    <a:xfrm>
+                      <a:off x="0" y="0"/>
+                      <a:ext cx="182880" cy="182880"/>
+                    </a:xfrm>
+                    <a:prstGeom prst="rect">
+                      <a:avLst/>
+                    </a:prstGeom>
+                  </pic:spPr>
+                </pic:pic>
+              </a:graphicData>
+            </a:graphic>
+          </wp:inline>
+        </w:drawing>
+      </w:r>
     </w:p>
     <w:p>
       <w:pPr>
@@ -2486,6 +2538,56 @@
           <w:szCs w:val="28"/>
         </w:rPr>
         <w:t xml:space="preserve">Реализовать создание уведомлений </w:t>
+      </w:r>
+      <w:r>
+        <w:rPr>
+          <w:rFonts w:ascii="Times New Roman" w:hAnsi="Times New Roman" w:cs="Times New Roman"/>
+          <w:noProof/>
+          <w:sz w:val="28"/>
+          <w:szCs w:val="28"/>
+          <w:highlight w:val="yellow"/>
+        </w:rPr>
+        <w:drawing>
+          <wp:inline distT="0" distB="0" distL="0" distR="0" wp14:anchorId="17FDE2C8" wp14:editId="01F1CF6D">
+            <wp:extent cx="182880" cy="182880"/>
+            <wp:effectExtent l="0" t="0" r="7620" b="7620"/>
+            <wp:docPr id="159037789" name="Рисунок 1" descr="Значок &quot;Галочка&quot; контур"/>
+            <wp:cNvGraphicFramePr>
+              <a:graphicFrameLocks xmlns:a="http://schemas.openxmlformats.org/drawingml/2006/main" noChangeAspect="1"/>
+            </wp:cNvGraphicFramePr>
+            <a:graphic xmlns:a="http://schemas.openxmlformats.org/drawingml/2006/main">
+              <a:graphicData uri="http://schemas.openxmlformats.org/drawingml/2006/picture">
+                <pic:pic xmlns:pic="http://schemas.openxmlformats.org/drawingml/2006/picture">
+                  <pic:nvPicPr>
+                    <pic:cNvPr id="914769617" name="Рисунок 914769617" descr="Значок &quot;Галочка&quot; контур"/>
+                    <pic:cNvPicPr/>
+                  </pic:nvPicPr>
+                  <pic:blipFill>
+                    <a:blip r:embed="rId6">
+                      <a:extLst>
+                        <a:ext uri="{96DAC541-7B7A-43D3-8B79-37D633B846F1}">
+                          <asvg:svgBlip xmlns:asvg="http://schemas.microsoft.com/office/drawing/2016/SVG/main" r:embed="rId7"/>
+                        </a:ext>
+                      </a:extLst>
+                    </a:blip>
+                    <a:stretch>
+                      <a:fillRect/>
+                    </a:stretch>
+                  </pic:blipFill>
+                  <pic:spPr>
+                    <a:xfrm>
+                      <a:off x="0" y="0"/>
+                      <a:ext cx="182880" cy="182880"/>
+                    </a:xfrm>
+                    <a:prstGeom prst="rect">
+                      <a:avLst/>
+                    </a:prstGeom>
+                  </pic:spPr>
+                </pic:pic>
+              </a:graphicData>
+            </a:graphic>
+          </wp:inline>
+        </w:drawing>
       </w:r>
     </w:p>
     <w:p>
@@ -2659,6 +2761,56 @@
           <w:szCs w:val="28"/>
         </w:rPr>
         <w:t xml:space="preserve">Реализовать автоматическое создание уведомлений о предстоящих платежах </w:t>
+      </w:r>
+      <w:r>
+        <w:rPr>
+          <w:rFonts w:ascii="Times New Roman" w:hAnsi="Times New Roman" w:cs="Times New Roman"/>
+          <w:noProof/>
+          <w:sz w:val="28"/>
+          <w:szCs w:val="28"/>
+          <w:highlight w:val="yellow"/>
+        </w:rPr>
+        <w:drawing>
+          <wp:inline distT="0" distB="0" distL="0" distR="0" wp14:anchorId="61B7E2BA" wp14:editId="6681F4FA">
+            <wp:extent cx="182880" cy="182880"/>
+            <wp:effectExtent l="0" t="0" r="7620" b="7620"/>
+            <wp:docPr id="1609655929" name="Рисунок 1" descr="Значок &quot;Галочка&quot; контур"/>
+            <wp:cNvGraphicFramePr>
+              <a:graphicFrameLocks xmlns:a="http://schemas.openxmlformats.org/drawingml/2006/main" noChangeAspect="1"/>
+            </wp:cNvGraphicFramePr>
+            <a:graphic xmlns:a="http://schemas.openxmlformats.org/drawingml/2006/main">
+              <a:graphicData uri="http://schemas.openxmlformats.org/drawingml/2006/picture">
+                <pic:pic xmlns:pic="http://schemas.openxmlformats.org/drawingml/2006/picture">
+                  <pic:nvPicPr>
+                    <pic:cNvPr id="914769617" name="Рисунок 914769617" descr="Значок &quot;Галочка&quot; контур"/>
+                    <pic:cNvPicPr/>
+                  </pic:nvPicPr>
+                  <pic:blipFill>
+                    <a:blip r:embed="rId6">
+                      <a:extLst>
+                        <a:ext uri="{96DAC541-7B7A-43D3-8B79-37D633B846F1}">
+                          <asvg:svgBlip xmlns:asvg="http://schemas.microsoft.com/office/drawing/2016/SVG/main" r:embed="rId7"/>
+                        </a:ext>
+                      </a:extLst>
+                    </a:blip>
+                    <a:stretch>
+                      <a:fillRect/>
+                    </a:stretch>
+                  </pic:blipFill>
+                  <pic:spPr>
+                    <a:xfrm>
+                      <a:off x="0" y="0"/>
+                      <a:ext cx="182880" cy="182880"/>
+                    </a:xfrm>
+                    <a:prstGeom prst="rect">
+                      <a:avLst/>
+                    </a:prstGeom>
+                  </pic:spPr>
+                </pic:pic>
+              </a:graphicData>
+            </a:graphic>
+          </wp:inline>
+        </w:drawing>
       </w:r>
     </w:p>
     <w:p>

</xml_diff>

<commit_message>
feat: filters for subscriptions
</commit_message>
<xml_diff>
--- a/Задачи/Backend/Маршрутный лист.docx
+++ b/Задачи/Backend/Маршрутный лист.docx
@@ -2610,6 +2610,56 @@
         </w:rPr>
         <w:t xml:space="preserve">Реализовать получение уведомлений </w:t>
       </w:r>
+      <w:r>
+        <w:rPr>
+          <w:rFonts w:ascii="Times New Roman" w:hAnsi="Times New Roman" w:cs="Times New Roman"/>
+          <w:noProof/>
+          <w:sz w:val="28"/>
+          <w:szCs w:val="28"/>
+          <w:highlight w:val="yellow"/>
+        </w:rPr>
+        <w:drawing>
+          <wp:inline distT="0" distB="0" distL="0" distR="0" wp14:anchorId="740A7CEC" wp14:editId="51676909">
+            <wp:extent cx="182880" cy="182880"/>
+            <wp:effectExtent l="0" t="0" r="7620" b="7620"/>
+            <wp:docPr id="1130005854" name="Рисунок 1" descr="Значок &quot;Галочка&quot; контур"/>
+            <wp:cNvGraphicFramePr>
+              <a:graphicFrameLocks xmlns:a="http://schemas.openxmlformats.org/drawingml/2006/main" noChangeAspect="1"/>
+            </wp:cNvGraphicFramePr>
+            <a:graphic xmlns:a="http://schemas.openxmlformats.org/drawingml/2006/main">
+              <a:graphicData uri="http://schemas.openxmlformats.org/drawingml/2006/picture">
+                <pic:pic xmlns:pic="http://schemas.openxmlformats.org/drawingml/2006/picture">
+                  <pic:nvPicPr>
+                    <pic:cNvPr id="914769617" name="Рисунок 914769617" descr="Значок &quot;Галочка&quot; контур"/>
+                    <pic:cNvPicPr/>
+                  </pic:nvPicPr>
+                  <pic:blipFill>
+                    <a:blip r:embed="rId6">
+                      <a:extLst>
+                        <a:ext uri="{96DAC541-7B7A-43D3-8B79-37D633B846F1}">
+                          <asvg:svgBlip xmlns:asvg="http://schemas.microsoft.com/office/drawing/2016/SVG/main" r:embed="rId7"/>
+                        </a:ext>
+                      </a:extLst>
+                    </a:blip>
+                    <a:stretch>
+                      <a:fillRect/>
+                    </a:stretch>
+                  </pic:blipFill>
+                  <pic:spPr>
+                    <a:xfrm>
+                      <a:off x="0" y="0"/>
+                      <a:ext cx="182880" cy="182880"/>
+                    </a:xfrm>
+                    <a:prstGeom prst="rect">
+                      <a:avLst/>
+                    </a:prstGeom>
+                  </pic:spPr>
+                </pic:pic>
+              </a:graphicData>
+            </a:graphic>
+          </wp:inline>
+        </w:drawing>
+      </w:r>
     </w:p>
     <w:p>
       <w:pPr>
@@ -2631,6 +2681,56 @@
         </w:rPr>
         <w:t xml:space="preserve">Реализовать отметку уведомления как прочитанного </w:t>
       </w:r>
+      <w:r>
+        <w:rPr>
+          <w:rFonts w:ascii="Times New Roman" w:hAnsi="Times New Roman" w:cs="Times New Roman"/>
+          <w:noProof/>
+          <w:sz w:val="28"/>
+          <w:szCs w:val="28"/>
+          <w:highlight w:val="yellow"/>
+        </w:rPr>
+        <w:drawing>
+          <wp:inline distT="0" distB="0" distL="0" distR="0" wp14:anchorId="767CC9B1" wp14:editId="2C528C41">
+            <wp:extent cx="182880" cy="182880"/>
+            <wp:effectExtent l="0" t="0" r="7620" b="7620"/>
+            <wp:docPr id="1627271767" name="Рисунок 1" descr="Значок &quot;Галочка&quot; контур"/>
+            <wp:cNvGraphicFramePr>
+              <a:graphicFrameLocks xmlns:a="http://schemas.openxmlformats.org/drawingml/2006/main" noChangeAspect="1"/>
+            </wp:cNvGraphicFramePr>
+            <a:graphic xmlns:a="http://schemas.openxmlformats.org/drawingml/2006/main">
+              <a:graphicData uri="http://schemas.openxmlformats.org/drawingml/2006/picture">
+                <pic:pic xmlns:pic="http://schemas.openxmlformats.org/drawingml/2006/picture">
+                  <pic:nvPicPr>
+                    <pic:cNvPr id="914769617" name="Рисунок 914769617" descr="Значок &quot;Галочка&quot; контур"/>
+                    <pic:cNvPicPr/>
+                  </pic:nvPicPr>
+                  <pic:blipFill>
+                    <a:blip r:embed="rId6">
+                      <a:extLst>
+                        <a:ext uri="{96DAC541-7B7A-43D3-8B79-37D633B846F1}">
+                          <asvg:svgBlip xmlns:asvg="http://schemas.microsoft.com/office/drawing/2016/SVG/main" r:embed="rId7"/>
+                        </a:ext>
+                      </a:extLst>
+                    </a:blip>
+                    <a:stretch>
+                      <a:fillRect/>
+                    </a:stretch>
+                  </pic:blipFill>
+                  <pic:spPr>
+                    <a:xfrm>
+                      <a:off x="0" y="0"/>
+                      <a:ext cx="182880" cy="182880"/>
+                    </a:xfrm>
+                    <a:prstGeom prst="rect">
+                      <a:avLst/>
+                    </a:prstGeom>
+                  </pic:spPr>
+                </pic:pic>
+              </a:graphicData>
+            </a:graphic>
+          </wp:inline>
+        </w:drawing>
+      </w:r>
     </w:p>
     <w:p>
       <w:pPr>
@@ -2651,6 +2751,56 @@
           <w:szCs w:val="28"/>
         </w:rPr>
         <w:t xml:space="preserve">Реализовать удаление уведомлений </w:t>
+      </w:r>
+      <w:r>
+        <w:rPr>
+          <w:rFonts w:ascii="Times New Roman" w:hAnsi="Times New Roman" w:cs="Times New Roman"/>
+          <w:noProof/>
+          <w:sz w:val="28"/>
+          <w:szCs w:val="28"/>
+          <w:highlight w:val="yellow"/>
+        </w:rPr>
+        <w:drawing>
+          <wp:inline distT="0" distB="0" distL="0" distR="0" wp14:anchorId="2EE67A27" wp14:editId="5AE8E6DC">
+            <wp:extent cx="182880" cy="182880"/>
+            <wp:effectExtent l="0" t="0" r="7620" b="7620"/>
+            <wp:docPr id="657467894" name="Рисунок 1" descr="Значок &quot;Галочка&quot; контур"/>
+            <wp:cNvGraphicFramePr>
+              <a:graphicFrameLocks xmlns:a="http://schemas.openxmlformats.org/drawingml/2006/main" noChangeAspect="1"/>
+            </wp:cNvGraphicFramePr>
+            <a:graphic xmlns:a="http://schemas.openxmlformats.org/drawingml/2006/main">
+              <a:graphicData uri="http://schemas.openxmlformats.org/drawingml/2006/picture">
+                <pic:pic xmlns:pic="http://schemas.openxmlformats.org/drawingml/2006/picture">
+                  <pic:nvPicPr>
+                    <pic:cNvPr id="914769617" name="Рисунок 914769617" descr="Значок &quot;Галочка&quot; контур"/>
+                    <pic:cNvPicPr/>
+                  </pic:nvPicPr>
+                  <pic:blipFill>
+                    <a:blip r:embed="rId6">
+                      <a:extLst>
+                        <a:ext uri="{96DAC541-7B7A-43D3-8B79-37D633B846F1}">
+                          <asvg:svgBlip xmlns:asvg="http://schemas.microsoft.com/office/drawing/2016/SVG/main" r:embed="rId7"/>
+                        </a:ext>
+                      </a:extLst>
+                    </a:blip>
+                    <a:stretch>
+                      <a:fillRect/>
+                    </a:stretch>
+                  </pic:blipFill>
+                  <pic:spPr>
+                    <a:xfrm>
+                      <a:off x="0" y="0"/>
+                      <a:ext cx="182880" cy="182880"/>
+                    </a:xfrm>
+                    <a:prstGeom prst="rect">
+                      <a:avLst/>
+                    </a:prstGeom>
+                  </pic:spPr>
+                </pic:pic>
+              </a:graphicData>
+            </a:graphic>
+          </wp:inline>
+        </w:drawing>
       </w:r>
     </w:p>
     <w:p>

</xml_diff>

<commit_message>
feat: analitics by month
</commit_message>
<xml_diff>
--- a/Задачи/Backend/Маршрутный лист.docx
+++ b/Задачи/Backend/Маршрутный лист.docx
@@ -282,27 +282,7 @@
           <w:szCs w:val="28"/>
           <w:highlight w:val="cyan"/>
         </w:rPr>
-        <w:t xml:space="preserve">Настроить </w:t>
-      </w:r>
-      <w:proofErr w:type="spellStart"/>
-      <w:r>
-        <w:rPr>
-          <w:rFonts w:ascii="Times New Roman" w:hAnsi="Times New Roman" w:cs="Times New Roman"/>
-          <w:sz w:val="28"/>
-          <w:szCs w:val="28"/>
-          <w:highlight w:val="cyan"/>
-        </w:rPr>
-        <w:t>Prisma</w:t>
-      </w:r>
-      <w:proofErr w:type="spellEnd"/>
-      <w:r>
-        <w:rPr>
-          <w:rFonts w:ascii="Times New Roman" w:hAnsi="Times New Roman" w:cs="Times New Roman"/>
-          <w:sz w:val="28"/>
-          <w:szCs w:val="28"/>
-          <w:highlight w:val="cyan"/>
-        </w:rPr>
-        <w:t xml:space="preserve"> </w:t>
+        <w:t xml:space="preserve">Настроить Prisma </w:t>
       </w:r>
       <w:r>
         <w:rPr>
@@ -377,7 +357,6 @@
         </w:rPr>
         <w:t xml:space="preserve">Описать </w:t>
       </w:r>
-      <w:proofErr w:type="spellStart"/>
       <w:proofErr w:type="gramStart"/>
       <w:r>
         <w:rPr>
@@ -388,7 +367,6 @@
         </w:rPr>
         <w:t>schema.prisma</w:t>
       </w:r>
-      <w:proofErr w:type="spellEnd"/>
       <w:proofErr w:type="gramEnd"/>
       <w:r>
         <w:rPr>
@@ -548,27 +526,7 @@
           <w:szCs w:val="28"/>
           <w:highlight w:val="cyan"/>
         </w:rPr>
-        <w:t xml:space="preserve">Сделать уникальным </w:t>
-      </w:r>
-      <w:proofErr w:type="spellStart"/>
-      <w:r>
-        <w:rPr>
-          <w:rFonts w:ascii="Times New Roman" w:hAnsi="Times New Roman" w:cs="Times New Roman"/>
-          <w:sz w:val="28"/>
-          <w:szCs w:val="28"/>
-          <w:highlight w:val="cyan"/>
-        </w:rPr>
-        <w:t>ключем</w:t>
-      </w:r>
-      <w:proofErr w:type="spellEnd"/>
-      <w:r>
-        <w:rPr>
-          <w:rFonts w:ascii="Times New Roman" w:hAnsi="Times New Roman" w:cs="Times New Roman"/>
-          <w:sz w:val="28"/>
-          <w:szCs w:val="28"/>
-          <w:highlight w:val="cyan"/>
-        </w:rPr>
-        <w:t xml:space="preserve"> поля (</w:t>
+        <w:t>Сделать уникальным ключем поля (</w:t>
       </w:r>
       <w:r>
         <w:rPr>
@@ -707,27 +665,7 @@
           <w:szCs w:val="28"/>
           <w:highlight w:val="yellow"/>
         </w:rPr>
-        <w:t>Реализовать регистрацию (</w:t>
-      </w:r>
-      <w:proofErr w:type="spellStart"/>
-      <w:r>
-        <w:rPr>
-          <w:rFonts w:ascii="Times New Roman" w:hAnsi="Times New Roman" w:cs="Times New Roman"/>
-          <w:sz w:val="28"/>
-          <w:szCs w:val="28"/>
-          <w:highlight w:val="yellow"/>
-        </w:rPr>
-        <w:t>hash</w:t>
-      </w:r>
-      <w:proofErr w:type="spellEnd"/>
-      <w:r>
-        <w:rPr>
-          <w:rFonts w:ascii="Times New Roman" w:hAnsi="Times New Roman" w:cs="Times New Roman"/>
-          <w:sz w:val="28"/>
-          <w:szCs w:val="28"/>
-          <w:highlight w:val="yellow"/>
-        </w:rPr>
-        <w:t xml:space="preserve"> пароля)</w:t>
+        <w:t>Реализовать регистрацию (hash пароля)</w:t>
       </w:r>
       <w:r>
         <w:rPr>
@@ -965,19 +903,8 @@
           <w:szCs w:val="28"/>
           <w:highlight w:val="yellow"/>
         </w:rPr>
-        <w:t xml:space="preserve">Реализовать refresh </w:t>
-      </w:r>
-      <w:proofErr w:type="spellStart"/>
-      <w:r>
-        <w:rPr>
-          <w:rFonts w:ascii="Times New Roman" w:hAnsi="Times New Roman" w:cs="Times New Roman"/>
-          <w:sz w:val="28"/>
-          <w:szCs w:val="28"/>
-          <w:highlight w:val="yellow"/>
-        </w:rPr>
-        <w:t>endpoint</w:t>
-      </w:r>
-      <w:proofErr w:type="spellEnd"/>
+        <w:t>Реализовать refresh endpoint</w:t>
+      </w:r>
       <w:r>
         <w:rPr>
           <w:rFonts w:ascii="Times New Roman" w:hAnsi="Times New Roman" w:cs="Times New Roman"/>
@@ -1068,27 +995,7 @@
           <w:szCs w:val="28"/>
           <w:highlight w:val="yellow"/>
         </w:rPr>
-        <w:t xml:space="preserve">Реализовать </w:t>
-      </w:r>
-      <w:proofErr w:type="spellStart"/>
-      <w:r>
-        <w:rPr>
-          <w:rFonts w:ascii="Times New Roman" w:hAnsi="Times New Roman" w:cs="Times New Roman"/>
-          <w:sz w:val="28"/>
-          <w:szCs w:val="28"/>
-          <w:highlight w:val="yellow"/>
-        </w:rPr>
-        <w:t>logout</w:t>
-      </w:r>
-      <w:proofErr w:type="spellEnd"/>
-      <w:r>
-        <w:rPr>
-          <w:rFonts w:ascii="Times New Roman" w:hAnsi="Times New Roman" w:cs="Times New Roman"/>
-          <w:sz w:val="28"/>
-          <w:szCs w:val="28"/>
-          <w:highlight w:val="yellow"/>
-        </w:rPr>
-        <w:t xml:space="preserve"> (удаление refresh токена) </w:t>
+        <w:t xml:space="preserve">Реализовать logout (удаление refresh токена) </w:t>
       </w:r>
       <w:r>
         <w:rPr>
@@ -1161,27 +1068,7 @@
           <w:szCs w:val="28"/>
           <w:highlight w:val="yellow"/>
         </w:rPr>
-        <w:t xml:space="preserve">Реализовать JWT guard (защита </w:t>
-      </w:r>
-      <w:proofErr w:type="spellStart"/>
-      <w:r>
-        <w:rPr>
-          <w:rFonts w:ascii="Times New Roman" w:hAnsi="Times New Roman" w:cs="Times New Roman"/>
-          <w:sz w:val="28"/>
-          <w:szCs w:val="28"/>
-          <w:highlight w:val="yellow"/>
-        </w:rPr>
-        <w:t>эндпоинтов</w:t>
-      </w:r>
-      <w:proofErr w:type="spellEnd"/>
-      <w:r>
-        <w:rPr>
-          <w:rFonts w:ascii="Times New Roman" w:hAnsi="Times New Roman" w:cs="Times New Roman"/>
-          <w:sz w:val="28"/>
-          <w:szCs w:val="28"/>
-          <w:highlight w:val="yellow"/>
-        </w:rPr>
-        <w:t xml:space="preserve">) </w:t>
+        <w:t xml:space="preserve">Реализовать JWT guard (защита эндпоинтов) </w:t>
       </w:r>
       <w:r>
         <w:rPr>
@@ -1513,25 +1400,7 @@
           <w:sz w:val="28"/>
           <w:szCs w:val="28"/>
         </w:rPr>
-        <w:t xml:space="preserve">Создание подписки (с расчётом </w:t>
-      </w:r>
-      <w:proofErr w:type="spellStart"/>
-      <w:r>
-        <w:rPr>
-          <w:rFonts w:ascii="Times New Roman" w:hAnsi="Times New Roman" w:cs="Times New Roman"/>
-          <w:sz w:val="28"/>
-          <w:szCs w:val="28"/>
-        </w:rPr>
-        <w:t>next_payment_at</w:t>
-      </w:r>
-      <w:proofErr w:type="spellEnd"/>
-      <w:r>
-        <w:rPr>
-          <w:rFonts w:ascii="Times New Roman" w:hAnsi="Times New Roman" w:cs="Times New Roman"/>
-          <w:sz w:val="28"/>
-          <w:szCs w:val="28"/>
-        </w:rPr>
-        <w:t xml:space="preserve">) </w:t>
+        <w:t xml:space="preserve">Создание подписки (с расчётом next_payment_at) </w:t>
       </w:r>
       <w:r>
         <w:rPr>
@@ -2284,25 +2153,7 @@
           <w:sz w:val="28"/>
           <w:szCs w:val="28"/>
         </w:rPr>
-        <w:t xml:space="preserve">Обновление </w:t>
-      </w:r>
-      <w:proofErr w:type="spellStart"/>
-      <w:r>
-        <w:rPr>
-          <w:rFonts w:ascii="Times New Roman" w:hAnsi="Times New Roman" w:cs="Times New Roman"/>
-          <w:sz w:val="28"/>
-          <w:szCs w:val="28"/>
-        </w:rPr>
-        <w:t>next_payment_at</w:t>
-      </w:r>
-      <w:proofErr w:type="spellEnd"/>
-      <w:r>
-        <w:rPr>
-          <w:rFonts w:ascii="Times New Roman" w:hAnsi="Times New Roman" w:cs="Times New Roman"/>
-          <w:sz w:val="28"/>
-          <w:szCs w:val="28"/>
-        </w:rPr>
-        <w:t xml:space="preserve"> после оплаты </w:t>
+        <w:t xml:space="preserve">Обновление next_payment_at после оплаты </w:t>
       </w:r>
       <w:r>
         <w:rPr>
@@ -2821,25 +2672,7 @@
           <w:sz w:val="28"/>
           <w:szCs w:val="28"/>
         </w:rPr>
-        <w:t>Реализовать фоновую задачу проверки подписок (</w:t>
-      </w:r>
-      <w:proofErr w:type="spellStart"/>
-      <w:r>
-        <w:rPr>
-          <w:rFonts w:ascii="Times New Roman" w:hAnsi="Times New Roman" w:cs="Times New Roman"/>
-          <w:sz w:val="28"/>
-          <w:szCs w:val="28"/>
-        </w:rPr>
-        <w:t>cron</w:t>
-      </w:r>
-      <w:proofErr w:type="spellEnd"/>
-      <w:r>
-        <w:rPr>
-          <w:rFonts w:ascii="Times New Roman" w:hAnsi="Times New Roman" w:cs="Times New Roman"/>
-          <w:sz w:val="28"/>
-          <w:szCs w:val="28"/>
-        </w:rPr>
-        <w:t xml:space="preserve">) </w:t>
+        <w:t xml:space="preserve">Реализовать фоновую задачу проверки подписок (cron) </w:t>
       </w:r>
       <w:r>
         <w:rPr>
@@ -3004,6 +2837,56 @@
         </w:rPr>
         <w:t xml:space="preserve">Поиск подписок по названию </w:t>
       </w:r>
+      <w:r>
+        <w:rPr>
+          <w:rFonts w:ascii="Times New Roman" w:hAnsi="Times New Roman" w:cs="Times New Roman"/>
+          <w:noProof/>
+          <w:sz w:val="28"/>
+          <w:szCs w:val="28"/>
+          <w:highlight w:val="yellow"/>
+        </w:rPr>
+        <w:drawing>
+          <wp:inline distT="0" distB="0" distL="0" distR="0" wp14:anchorId="75494617" wp14:editId="1712E1E9">
+            <wp:extent cx="182880" cy="182880"/>
+            <wp:effectExtent l="0" t="0" r="7620" b="7620"/>
+            <wp:docPr id="1706101532" name="Рисунок 1" descr="Значок &quot;Галочка&quot; контур"/>
+            <wp:cNvGraphicFramePr>
+              <a:graphicFrameLocks xmlns:a="http://schemas.openxmlformats.org/drawingml/2006/main" noChangeAspect="1"/>
+            </wp:cNvGraphicFramePr>
+            <a:graphic xmlns:a="http://schemas.openxmlformats.org/drawingml/2006/main">
+              <a:graphicData uri="http://schemas.openxmlformats.org/drawingml/2006/picture">
+                <pic:pic xmlns:pic="http://schemas.openxmlformats.org/drawingml/2006/picture">
+                  <pic:nvPicPr>
+                    <pic:cNvPr id="914769617" name="Рисунок 914769617" descr="Значок &quot;Галочка&quot; контур"/>
+                    <pic:cNvPicPr/>
+                  </pic:nvPicPr>
+                  <pic:blipFill>
+                    <a:blip r:embed="rId6">
+                      <a:extLst>
+                        <a:ext uri="{96DAC541-7B7A-43D3-8B79-37D633B846F1}">
+                          <asvg:svgBlip xmlns:asvg="http://schemas.microsoft.com/office/drawing/2016/SVG/main" r:embed="rId7"/>
+                        </a:ext>
+                      </a:extLst>
+                    </a:blip>
+                    <a:stretch>
+                      <a:fillRect/>
+                    </a:stretch>
+                  </pic:blipFill>
+                  <pic:spPr>
+                    <a:xfrm>
+                      <a:off x="0" y="0"/>
+                      <a:ext cx="182880" cy="182880"/>
+                    </a:xfrm>
+                    <a:prstGeom prst="rect">
+                      <a:avLst/>
+                    </a:prstGeom>
+                  </pic:spPr>
+                </pic:pic>
+              </a:graphicData>
+            </a:graphic>
+          </wp:inline>
+        </w:drawing>
+      </w:r>
     </w:p>
     <w:p>
       <w:pPr>
@@ -3025,6 +2908,56 @@
         </w:rPr>
         <w:t xml:space="preserve">Фильтрация по статусу </w:t>
       </w:r>
+      <w:r>
+        <w:rPr>
+          <w:rFonts w:ascii="Times New Roman" w:hAnsi="Times New Roman" w:cs="Times New Roman"/>
+          <w:noProof/>
+          <w:sz w:val="28"/>
+          <w:szCs w:val="28"/>
+          <w:highlight w:val="yellow"/>
+        </w:rPr>
+        <w:drawing>
+          <wp:inline distT="0" distB="0" distL="0" distR="0" wp14:anchorId="775B2C33" wp14:editId="7FBB933D">
+            <wp:extent cx="182880" cy="182880"/>
+            <wp:effectExtent l="0" t="0" r="7620" b="7620"/>
+            <wp:docPr id="44061542" name="Рисунок 1" descr="Значок &quot;Галочка&quot; контур"/>
+            <wp:cNvGraphicFramePr>
+              <a:graphicFrameLocks xmlns:a="http://schemas.openxmlformats.org/drawingml/2006/main" noChangeAspect="1"/>
+            </wp:cNvGraphicFramePr>
+            <a:graphic xmlns:a="http://schemas.openxmlformats.org/drawingml/2006/main">
+              <a:graphicData uri="http://schemas.openxmlformats.org/drawingml/2006/picture">
+                <pic:pic xmlns:pic="http://schemas.openxmlformats.org/drawingml/2006/picture">
+                  <pic:nvPicPr>
+                    <pic:cNvPr id="914769617" name="Рисунок 914769617" descr="Значок &quot;Галочка&quot; контур"/>
+                    <pic:cNvPicPr/>
+                  </pic:nvPicPr>
+                  <pic:blipFill>
+                    <a:blip r:embed="rId6">
+                      <a:extLst>
+                        <a:ext uri="{96DAC541-7B7A-43D3-8B79-37D633B846F1}">
+                          <asvg:svgBlip xmlns:asvg="http://schemas.microsoft.com/office/drawing/2016/SVG/main" r:embed="rId7"/>
+                        </a:ext>
+                      </a:extLst>
+                    </a:blip>
+                    <a:stretch>
+                      <a:fillRect/>
+                    </a:stretch>
+                  </pic:blipFill>
+                  <pic:spPr>
+                    <a:xfrm>
+                      <a:off x="0" y="0"/>
+                      <a:ext cx="182880" cy="182880"/>
+                    </a:xfrm>
+                    <a:prstGeom prst="rect">
+                      <a:avLst/>
+                    </a:prstGeom>
+                  </pic:spPr>
+                </pic:pic>
+              </a:graphicData>
+            </a:graphic>
+          </wp:inline>
+        </w:drawing>
+      </w:r>
     </w:p>
     <w:p>
       <w:pPr>
@@ -3044,7 +2977,74 @@
           <w:sz w:val="28"/>
           <w:szCs w:val="28"/>
         </w:rPr>
-        <w:t xml:space="preserve">Фильтрация по категории </w:t>
+        <w:t>Фильтрация по категории</w:t>
+      </w:r>
+      <w:r>
+        <w:rPr>
+          <w:rFonts w:ascii="Times New Roman" w:hAnsi="Times New Roman" w:cs="Times New Roman"/>
+          <w:sz w:val="28"/>
+          <w:szCs w:val="28"/>
+          <w:lang w:val="en-US"/>
+        </w:rPr>
+        <w:t xml:space="preserve"> </w:t>
+      </w:r>
+      <w:r>
+        <w:rPr>
+          <w:rFonts w:ascii="Times New Roman" w:hAnsi="Times New Roman" w:cs="Times New Roman"/>
+          <w:noProof/>
+          <w:sz w:val="28"/>
+          <w:szCs w:val="28"/>
+          <w:highlight w:val="yellow"/>
+        </w:rPr>
+        <w:drawing>
+          <wp:inline distT="0" distB="0" distL="0" distR="0" wp14:anchorId="000D82C4" wp14:editId="215E4ABC">
+            <wp:extent cx="182880" cy="182880"/>
+            <wp:effectExtent l="0" t="0" r="7620" b="7620"/>
+            <wp:docPr id="1905770800" name="Рисунок 1" descr="Значок &quot;Галочка&quot; контур"/>
+            <wp:cNvGraphicFramePr>
+              <a:graphicFrameLocks xmlns:a="http://schemas.openxmlformats.org/drawingml/2006/main" noChangeAspect="1"/>
+            </wp:cNvGraphicFramePr>
+            <a:graphic xmlns:a="http://schemas.openxmlformats.org/drawingml/2006/main">
+              <a:graphicData uri="http://schemas.openxmlformats.org/drawingml/2006/picture">
+                <pic:pic xmlns:pic="http://schemas.openxmlformats.org/drawingml/2006/picture">
+                  <pic:nvPicPr>
+                    <pic:cNvPr id="914769617" name="Рисунок 914769617" descr="Значок &quot;Галочка&quot; контур"/>
+                    <pic:cNvPicPr/>
+                  </pic:nvPicPr>
+                  <pic:blipFill>
+                    <a:blip r:embed="rId6">
+                      <a:extLst>
+                        <a:ext uri="{96DAC541-7B7A-43D3-8B79-37D633B846F1}">
+                          <asvg:svgBlip xmlns:asvg="http://schemas.microsoft.com/office/drawing/2016/SVG/main" r:embed="rId7"/>
+                        </a:ext>
+                      </a:extLst>
+                    </a:blip>
+                    <a:stretch>
+                      <a:fillRect/>
+                    </a:stretch>
+                  </pic:blipFill>
+                  <pic:spPr>
+                    <a:xfrm>
+                      <a:off x="0" y="0"/>
+                      <a:ext cx="182880" cy="182880"/>
+                    </a:xfrm>
+                    <a:prstGeom prst="rect">
+                      <a:avLst/>
+                    </a:prstGeom>
+                  </pic:spPr>
+                </pic:pic>
+              </a:graphicData>
+            </a:graphic>
+          </wp:inline>
+        </w:drawing>
+      </w:r>
+      <w:r>
+        <w:rPr>
+          <w:rFonts w:ascii="Times New Roman" w:hAnsi="Times New Roman" w:cs="Times New Roman"/>
+          <w:sz w:val="28"/>
+          <w:szCs w:val="28"/>
+        </w:rPr>
+        <w:t xml:space="preserve"> </w:t>
       </w:r>
     </w:p>
     <w:p>
@@ -3057,33 +3057,92 @@
           <w:rFonts w:ascii="Times New Roman" w:hAnsi="Times New Roman" w:cs="Times New Roman"/>
           <w:sz w:val="28"/>
           <w:szCs w:val="28"/>
-        </w:rPr>
-      </w:pPr>
-      <w:r>
-        <w:rPr>
-          <w:rFonts w:ascii="Times New Roman" w:hAnsi="Times New Roman" w:cs="Times New Roman"/>
-          <w:sz w:val="28"/>
-          <w:szCs w:val="28"/>
-        </w:rPr>
-        <w:t xml:space="preserve">Сортировка по </w:t>
-      </w:r>
-      <w:proofErr w:type="spellStart"/>
-      <w:r>
-        <w:rPr>
-          <w:rFonts w:ascii="Times New Roman" w:hAnsi="Times New Roman" w:cs="Times New Roman"/>
-          <w:sz w:val="28"/>
-          <w:szCs w:val="28"/>
-        </w:rPr>
-        <w:t>next_payment_at</w:t>
-      </w:r>
-      <w:proofErr w:type="spellEnd"/>
-      <w:r>
-        <w:rPr>
-          <w:rFonts w:ascii="Times New Roman" w:hAnsi="Times New Roman" w:cs="Times New Roman"/>
-          <w:sz w:val="28"/>
-          <w:szCs w:val="28"/>
+          <w:lang w:val="en-US"/>
+        </w:rPr>
+      </w:pPr>
+      <w:r>
+        <w:rPr>
+          <w:rFonts w:ascii="Times New Roman" w:hAnsi="Times New Roman" w:cs="Times New Roman"/>
+          <w:sz w:val="28"/>
+          <w:szCs w:val="28"/>
+        </w:rPr>
+        <w:t>Сортировка</w:t>
+      </w:r>
+      <w:r>
+        <w:rPr>
+          <w:rFonts w:ascii="Times New Roman" w:hAnsi="Times New Roman" w:cs="Times New Roman"/>
+          <w:sz w:val="28"/>
+          <w:szCs w:val="28"/>
+          <w:lang w:val="en-US"/>
         </w:rPr>
         <w:t xml:space="preserve"> </w:t>
+      </w:r>
+      <w:r>
+        <w:rPr>
+          <w:rFonts w:ascii="Times New Roman" w:hAnsi="Times New Roman" w:cs="Times New Roman"/>
+          <w:sz w:val="28"/>
+          <w:szCs w:val="28"/>
+        </w:rPr>
+        <w:t>по</w:t>
+      </w:r>
+      <w:r>
+        <w:rPr>
+          <w:rFonts w:ascii="Times New Roman" w:hAnsi="Times New Roman" w:cs="Times New Roman"/>
+          <w:sz w:val="28"/>
+          <w:szCs w:val="28"/>
+          <w:lang w:val="en-US"/>
+        </w:rPr>
+        <w:t xml:space="preserve"> next_payment_at </w:t>
+      </w:r>
+      <w:r>
+        <w:rPr>
+          <w:rFonts w:ascii="Times New Roman" w:hAnsi="Times New Roman" w:cs="Times New Roman"/>
+          <w:noProof/>
+          <w:sz w:val="28"/>
+          <w:szCs w:val="28"/>
+          <w:highlight w:val="yellow"/>
+        </w:rPr>
+        <w:drawing>
+          <wp:inline distT="0" distB="0" distL="0" distR="0" wp14:anchorId="3623E00E" wp14:editId="19573B07">
+            <wp:extent cx="182880" cy="182880"/>
+            <wp:effectExtent l="0" t="0" r="7620" b="7620"/>
+            <wp:docPr id="1579668579" name="Рисунок 1" descr="Значок &quot;Галочка&quot; контур"/>
+            <wp:cNvGraphicFramePr>
+              <a:graphicFrameLocks xmlns:a="http://schemas.openxmlformats.org/drawingml/2006/main" noChangeAspect="1"/>
+            </wp:cNvGraphicFramePr>
+            <a:graphic xmlns:a="http://schemas.openxmlformats.org/drawingml/2006/main">
+              <a:graphicData uri="http://schemas.openxmlformats.org/drawingml/2006/picture">
+                <pic:pic xmlns:pic="http://schemas.openxmlformats.org/drawingml/2006/picture">
+                  <pic:nvPicPr>
+                    <pic:cNvPr id="914769617" name="Рисунок 914769617" descr="Значок &quot;Галочка&quot; контур"/>
+                    <pic:cNvPicPr/>
+                  </pic:nvPicPr>
+                  <pic:blipFill>
+                    <a:blip r:embed="rId6">
+                      <a:extLst>
+                        <a:ext uri="{96DAC541-7B7A-43D3-8B79-37D633B846F1}">
+                          <asvg:svgBlip xmlns:asvg="http://schemas.microsoft.com/office/drawing/2016/SVG/main" r:embed="rId7"/>
+                        </a:ext>
+                      </a:extLst>
+                    </a:blip>
+                    <a:stretch>
+                      <a:fillRect/>
+                    </a:stretch>
+                  </pic:blipFill>
+                  <pic:spPr>
+                    <a:xfrm>
+                      <a:off x="0" y="0"/>
+                      <a:ext cx="182880" cy="182880"/>
+                    </a:xfrm>
+                    <a:prstGeom prst="rect">
+                      <a:avLst/>
+                    </a:prstGeom>
+                  </pic:spPr>
+                </pic:pic>
+              </a:graphicData>
+            </a:graphic>
+          </wp:inline>
+        </w:drawing>
       </w:r>
     </w:p>
     <w:p>
@@ -3106,6 +3165,56 @@
         </w:rPr>
         <w:t xml:space="preserve">Сортировка по стоимости </w:t>
       </w:r>
+      <w:r>
+        <w:rPr>
+          <w:rFonts w:ascii="Times New Roman" w:hAnsi="Times New Roman" w:cs="Times New Roman"/>
+          <w:noProof/>
+          <w:sz w:val="28"/>
+          <w:szCs w:val="28"/>
+          <w:highlight w:val="yellow"/>
+        </w:rPr>
+        <w:drawing>
+          <wp:inline distT="0" distB="0" distL="0" distR="0" wp14:anchorId="2FDCF205" wp14:editId="4A3D6A68">
+            <wp:extent cx="182880" cy="182880"/>
+            <wp:effectExtent l="0" t="0" r="7620" b="7620"/>
+            <wp:docPr id="384792875" name="Рисунок 1" descr="Значок &quot;Галочка&quot; контур"/>
+            <wp:cNvGraphicFramePr>
+              <a:graphicFrameLocks xmlns:a="http://schemas.openxmlformats.org/drawingml/2006/main" noChangeAspect="1"/>
+            </wp:cNvGraphicFramePr>
+            <a:graphic xmlns:a="http://schemas.openxmlformats.org/drawingml/2006/main">
+              <a:graphicData uri="http://schemas.openxmlformats.org/drawingml/2006/picture">
+                <pic:pic xmlns:pic="http://schemas.openxmlformats.org/drawingml/2006/picture">
+                  <pic:nvPicPr>
+                    <pic:cNvPr id="914769617" name="Рисунок 914769617" descr="Значок &quot;Галочка&quot; контур"/>
+                    <pic:cNvPicPr/>
+                  </pic:nvPicPr>
+                  <pic:blipFill>
+                    <a:blip r:embed="rId6">
+                      <a:extLst>
+                        <a:ext uri="{96DAC541-7B7A-43D3-8B79-37D633B846F1}">
+                          <asvg:svgBlip xmlns:asvg="http://schemas.microsoft.com/office/drawing/2016/SVG/main" r:embed="rId7"/>
+                        </a:ext>
+                      </a:extLst>
+                    </a:blip>
+                    <a:stretch>
+                      <a:fillRect/>
+                    </a:stretch>
+                  </pic:blipFill>
+                  <pic:spPr>
+                    <a:xfrm>
+                      <a:off x="0" y="0"/>
+                      <a:ext cx="182880" cy="182880"/>
+                    </a:xfrm>
+                    <a:prstGeom prst="rect">
+                      <a:avLst/>
+                    </a:prstGeom>
+                  </pic:spPr>
+                </pic:pic>
+              </a:graphicData>
+            </a:graphic>
+          </wp:inline>
+        </w:drawing>
+      </w:r>
     </w:p>
     <w:p>
       <w:pPr>
@@ -3167,6 +3276,7 @@
           <w:sz w:val="28"/>
           <w:szCs w:val="28"/>
         </w:rPr>
+        <w:lastRenderedPageBreak/>
         <w:t xml:space="preserve">Расчёт расходов за месяц </w:t>
       </w:r>
     </w:p>
@@ -3188,7 +3298,6 @@
           <w:sz w:val="28"/>
           <w:szCs w:val="28"/>
         </w:rPr>
-        <w:lastRenderedPageBreak/>
         <w:t xml:space="preserve">Расчёт расходов за год </w:t>
       </w:r>
     </w:p>
@@ -3273,25 +3382,7 @@
           <w:sz w:val="28"/>
           <w:szCs w:val="28"/>
         </w:rPr>
-        <w:t>Проверка доступа к данным (</w:t>
-      </w:r>
-      <w:proofErr w:type="spellStart"/>
-      <w:r>
-        <w:rPr>
-          <w:rFonts w:ascii="Times New Roman" w:hAnsi="Times New Roman" w:cs="Times New Roman"/>
-          <w:sz w:val="28"/>
-          <w:szCs w:val="28"/>
-        </w:rPr>
-        <w:t>ownership</w:t>
-      </w:r>
-      <w:proofErr w:type="spellEnd"/>
-      <w:r>
-        <w:rPr>
-          <w:rFonts w:ascii="Times New Roman" w:hAnsi="Times New Roman" w:cs="Times New Roman"/>
-          <w:sz w:val="28"/>
-          <w:szCs w:val="28"/>
-        </w:rPr>
-        <w:t xml:space="preserve">) </w:t>
+        <w:t xml:space="preserve">Проверка доступа к данным (ownership) </w:t>
       </w:r>
     </w:p>
     <w:p>

</xml_diff>

<commit_message>
fix: fix analitics future amount
</commit_message>
<xml_diff>
--- a/Задачи/Backend/Маршрутный лист.docx
+++ b/Задачи/Backend/Маршрутный лист.docx
@@ -282,7 +282,27 @@
           <w:szCs w:val="28"/>
           <w:highlight w:val="cyan"/>
         </w:rPr>
-        <w:t xml:space="preserve">Настроить Prisma </w:t>
+        <w:t xml:space="preserve">Настроить </w:t>
+      </w:r>
+      <w:proofErr w:type="spellStart"/>
+      <w:r>
+        <w:rPr>
+          <w:rFonts w:ascii="Times New Roman" w:hAnsi="Times New Roman" w:cs="Times New Roman"/>
+          <w:sz w:val="28"/>
+          <w:szCs w:val="28"/>
+          <w:highlight w:val="cyan"/>
+        </w:rPr>
+        <w:t>Prisma</w:t>
+      </w:r>
+      <w:proofErr w:type="spellEnd"/>
+      <w:r>
+        <w:rPr>
+          <w:rFonts w:ascii="Times New Roman" w:hAnsi="Times New Roman" w:cs="Times New Roman"/>
+          <w:sz w:val="28"/>
+          <w:szCs w:val="28"/>
+          <w:highlight w:val="cyan"/>
+        </w:rPr>
+        <w:t xml:space="preserve"> </w:t>
       </w:r>
       <w:r>
         <w:rPr>
@@ -357,6 +377,7 @@
         </w:rPr>
         <w:t xml:space="preserve">Описать </w:t>
       </w:r>
+      <w:proofErr w:type="spellStart"/>
       <w:proofErr w:type="gramStart"/>
       <w:r>
         <w:rPr>
@@ -367,6 +388,7 @@
         </w:rPr>
         <w:t>schema.prisma</w:t>
       </w:r>
+      <w:proofErr w:type="spellEnd"/>
       <w:proofErr w:type="gramEnd"/>
       <w:r>
         <w:rPr>
@@ -526,7 +548,27 @@
           <w:szCs w:val="28"/>
           <w:highlight w:val="cyan"/>
         </w:rPr>
-        <w:t>Сделать уникальным ключем поля (</w:t>
+        <w:t xml:space="preserve">Сделать уникальным </w:t>
+      </w:r>
+      <w:proofErr w:type="spellStart"/>
+      <w:r>
+        <w:rPr>
+          <w:rFonts w:ascii="Times New Roman" w:hAnsi="Times New Roman" w:cs="Times New Roman"/>
+          <w:sz w:val="28"/>
+          <w:szCs w:val="28"/>
+          <w:highlight w:val="cyan"/>
+        </w:rPr>
+        <w:t>ключем</w:t>
+      </w:r>
+      <w:proofErr w:type="spellEnd"/>
+      <w:r>
+        <w:rPr>
+          <w:rFonts w:ascii="Times New Roman" w:hAnsi="Times New Roman" w:cs="Times New Roman"/>
+          <w:sz w:val="28"/>
+          <w:szCs w:val="28"/>
+          <w:highlight w:val="cyan"/>
+        </w:rPr>
+        <w:t xml:space="preserve"> поля (</w:t>
       </w:r>
       <w:r>
         <w:rPr>
@@ -665,7 +707,27 @@
           <w:szCs w:val="28"/>
           <w:highlight w:val="yellow"/>
         </w:rPr>
-        <w:t>Реализовать регистрацию (hash пароля)</w:t>
+        <w:t>Реализовать регистрацию (</w:t>
+      </w:r>
+      <w:proofErr w:type="spellStart"/>
+      <w:r>
+        <w:rPr>
+          <w:rFonts w:ascii="Times New Roman" w:hAnsi="Times New Roman" w:cs="Times New Roman"/>
+          <w:sz w:val="28"/>
+          <w:szCs w:val="28"/>
+          <w:highlight w:val="yellow"/>
+        </w:rPr>
+        <w:t>hash</w:t>
+      </w:r>
+      <w:proofErr w:type="spellEnd"/>
+      <w:r>
+        <w:rPr>
+          <w:rFonts w:ascii="Times New Roman" w:hAnsi="Times New Roman" w:cs="Times New Roman"/>
+          <w:sz w:val="28"/>
+          <w:szCs w:val="28"/>
+          <w:highlight w:val="yellow"/>
+        </w:rPr>
+        <w:t xml:space="preserve"> пароля)</w:t>
       </w:r>
       <w:r>
         <w:rPr>
@@ -903,8 +965,19 @@
           <w:szCs w:val="28"/>
           <w:highlight w:val="yellow"/>
         </w:rPr>
-        <w:t>Реализовать refresh endpoint</w:t>
-      </w:r>
+        <w:t xml:space="preserve">Реализовать refresh </w:t>
+      </w:r>
+      <w:proofErr w:type="spellStart"/>
+      <w:r>
+        <w:rPr>
+          <w:rFonts w:ascii="Times New Roman" w:hAnsi="Times New Roman" w:cs="Times New Roman"/>
+          <w:sz w:val="28"/>
+          <w:szCs w:val="28"/>
+          <w:highlight w:val="yellow"/>
+        </w:rPr>
+        <w:t>endpoint</w:t>
+      </w:r>
+      <w:proofErr w:type="spellEnd"/>
       <w:r>
         <w:rPr>
           <w:rFonts w:ascii="Times New Roman" w:hAnsi="Times New Roman" w:cs="Times New Roman"/>
@@ -995,7 +1068,27 @@
           <w:szCs w:val="28"/>
           <w:highlight w:val="yellow"/>
         </w:rPr>
-        <w:t xml:space="preserve">Реализовать logout (удаление refresh токена) </w:t>
+        <w:t xml:space="preserve">Реализовать </w:t>
+      </w:r>
+      <w:proofErr w:type="spellStart"/>
+      <w:r>
+        <w:rPr>
+          <w:rFonts w:ascii="Times New Roman" w:hAnsi="Times New Roman" w:cs="Times New Roman"/>
+          <w:sz w:val="28"/>
+          <w:szCs w:val="28"/>
+          <w:highlight w:val="yellow"/>
+        </w:rPr>
+        <w:t>logout</w:t>
+      </w:r>
+      <w:proofErr w:type="spellEnd"/>
+      <w:r>
+        <w:rPr>
+          <w:rFonts w:ascii="Times New Roman" w:hAnsi="Times New Roman" w:cs="Times New Roman"/>
+          <w:sz w:val="28"/>
+          <w:szCs w:val="28"/>
+          <w:highlight w:val="yellow"/>
+        </w:rPr>
+        <w:t xml:space="preserve"> (удаление refresh токена) </w:t>
       </w:r>
       <w:r>
         <w:rPr>
@@ -1068,7 +1161,27 @@
           <w:szCs w:val="28"/>
           <w:highlight w:val="yellow"/>
         </w:rPr>
-        <w:t xml:space="preserve">Реализовать JWT guard (защита эндпоинтов) </w:t>
+        <w:t xml:space="preserve">Реализовать JWT guard (защита </w:t>
+      </w:r>
+      <w:proofErr w:type="spellStart"/>
+      <w:r>
+        <w:rPr>
+          <w:rFonts w:ascii="Times New Roman" w:hAnsi="Times New Roman" w:cs="Times New Roman"/>
+          <w:sz w:val="28"/>
+          <w:szCs w:val="28"/>
+          <w:highlight w:val="yellow"/>
+        </w:rPr>
+        <w:t>эндпоинтов</w:t>
+      </w:r>
+      <w:proofErr w:type="spellEnd"/>
+      <w:r>
+        <w:rPr>
+          <w:rFonts w:ascii="Times New Roman" w:hAnsi="Times New Roman" w:cs="Times New Roman"/>
+          <w:sz w:val="28"/>
+          <w:szCs w:val="28"/>
+          <w:highlight w:val="yellow"/>
+        </w:rPr>
+        <w:t xml:space="preserve">) </w:t>
       </w:r>
       <w:r>
         <w:rPr>
@@ -1392,15 +1505,37 @@
           <w:rFonts w:ascii="Times New Roman" w:hAnsi="Times New Roman" w:cs="Times New Roman"/>
           <w:sz w:val="28"/>
           <w:szCs w:val="28"/>
-        </w:rPr>
-      </w:pPr>
-      <w:r>
-        <w:rPr>
-          <w:rFonts w:ascii="Times New Roman" w:hAnsi="Times New Roman" w:cs="Times New Roman"/>
-          <w:sz w:val="28"/>
-          <w:szCs w:val="28"/>
-        </w:rPr>
-        <w:t xml:space="preserve">Создание подписки (с расчётом next_payment_at) </w:t>
+          <w:highlight w:val="yellow"/>
+        </w:rPr>
+      </w:pPr>
+      <w:r>
+        <w:rPr>
+          <w:rFonts w:ascii="Times New Roman" w:hAnsi="Times New Roman" w:cs="Times New Roman"/>
+          <w:sz w:val="28"/>
+          <w:szCs w:val="28"/>
+          <w:highlight w:val="yellow"/>
+        </w:rPr>
+        <w:t xml:space="preserve">Создание подписки (с расчётом </w:t>
+      </w:r>
+      <w:proofErr w:type="spellStart"/>
+      <w:r>
+        <w:rPr>
+          <w:rFonts w:ascii="Times New Roman" w:hAnsi="Times New Roman" w:cs="Times New Roman"/>
+          <w:sz w:val="28"/>
+          <w:szCs w:val="28"/>
+          <w:highlight w:val="yellow"/>
+        </w:rPr>
+        <w:t>next_payment_at</w:t>
+      </w:r>
+      <w:proofErr w:type="spellEnd"/>
+      <w:r>
+        <w:rPr>
+          <w:rFonts w:ascii="Times New Roman" w:hAnsi="Times New Roman" w:cs="Times New Roman"/>
+          <w:sz w:val="28"/>
+          <w:szCs w:val="28"/>
+          <w:highlight w:val="yellow"/>
+        </w:rPr>
+        <w:t xml:space="preserve">) </w:t>
       </w:r>
       <w:r>
         <w:rPr>
@@ -1463,13 +1598,15 @@
           <w:rFonts w:ascii="Times New Roman" w:hAnsi="Times New Roman" w:cs="Times New Roman"/>
           <w:sz w:val="28"/>
           <w:szCs w:val="28"/>
-        </w:rPr>
-      </w:pPr>
-      <w:r>
-        <w:rPr>
-          <w:rFonts w:ascii="Times New Roman" w:hAnsi="Times New Roman" w:cs="Times New Roman"/>
-          <w:sz w:val="28"/>
-          <w:szCs w:val="28"/>
+          <w:highlight w:val="yellow"/>
+        </w:rPr>
+      </w:pPr>
+      <w:r>
+        <w:rPr>
+          <w:rFonts w:ascii="Times New Roman" w:hAnsi="Times New Roman" w:cs="Times New Roman"/>
+          <w:sz w:val="28"/>
+          <w:szCs w:val="28"/>
+          <w:highlight w:val="yellow"/>
         </w:rPr>
         <w:t xml:space="preserve">Получение списка подписок пользователя </w:t>
       </w:r>
@@ -1534,13 +1671,15 @@
           <w:rFonts w:ascii="Times New Roman" w:hAnsi="Times New Roman" w:cs="Times New Roman"/>
           <w:sz w:val="28"/>
           <w:szCs w:val="28"/>
-        </w:rPr>
-      </w:pPr>
-      <w:r>
-        <w:rPr>
-          <w:rFonts w:ascii="Times New Roman" w:hAnsi="Times New Roman" w:cs="Times New Roman"/>
-          <w:sz w:val="28"/>
-          <w:szCs w:val="28"/>
+          <w:highlight w:val="yellow"/>
+        </w:rPr>
+      </w:pPr>
+      <w:r>
+        <w:rPr>
+          <w:rFonts w:ascii="Times New Roman" w:hAnsi="Times New Roman" w:cs="Times New Roman"/>
+          <w:sz w:val="28"/>
+          <w:szCs w:val="28"/>
+          <w:highlight w:val="yellow"/>
         </w:rPr>
         <w:t xml:space="preserve">Получение одной подписки </w:t>
       </w:r>
@@ -1605,13 +1744,15 @@
           <w:rFonts w:ascii="Times New Roman" w:hAnsi="Times New Roman" w:cs="Times New Roman"/>
           <w:sz w:val="28"/>
           <w:szCs w:val="28"/>
-        </w:rPr>
-      </w:pPr>
-      <w:r>
-        <w:rPr>
-          <w:rFonts w:ascii="Times New Roman" w:hAnsi="Times New Roman" w:cs="Times New Roman"/>
-          <w:sz w:val="28"/>
-          <w:szCs w:val="28"/>
+          <w:highlight w:val="yellow"/>
+        </w:rPr>
+      </w:pPr>
+      <w:r>
+        <w:rPr>
+          <w:rFonts w:ascii="Times New Roman" w:hAnsi="Times New Roman" w:cs="Times New Roman"/>
+          <w:sz w:val="28"/>
+          <w:szCs w:val="28"/>
+          <w:highlight w:val="yellow"/>
         </w:rPr>
         <w:t xml:space="preserve">Обновление подписки </w:t>
       </w:r>
@@ -1676,13 +1817,15 @@
           <w:rFonts w:ascii="Times New Roman" w:hAnsi="Times New Roman" w:cs="Times New Roman"/>
           <w:sz w:val="28"/>
           <w:szCs w:val="28"/>
-        </w:rPr>
-      </w:pPr>
-      <w:r>
-        <w:rPr>
-          <w:rFonts w:ascii="Times New Roman" w:hAnsi="Times New Roman" w:cs="Times New Roman"/>
-          <w:sz w:val="28"/>
-          <w:szCs w:val="28"/>
+          <w:highlight w:val="yellow"/>
+        </w:rPr>
+      </w:pPr>
+      <w:r>
+        <w:rPr>
+          <w:rFonts w:ascii="Times New Roman" w:hAnsi="Times New Roman" w:cs="Times New Roman"/>
+          <w:sz w:val="28"/>
+          <w:szCs w:val="28"/>
+          <w:highlight w:val="yellow"/>
         </w:rPr>
         <w:t xml:space="preserve">Удаление подписки </w:t>
       </w:r>
@@ -1769,13 +1912,15 @@
           <w:rFonts w:ascii="Times New Roman" w:hAnsi="Times New Roman" w:cs="Times New Roman"/>
           <w:sz w:val="28"/>
           <w:szCs w:val="28"/>
-        </w:rPr>
-      </w:pPr>
-      <w:r>
-        <w:rPr>
-          <w:rFonts w:ascii="Times New Roman" w:hAnsi="Times New Roman" w:cs="Times New Roman"/>
-          <w:sz w:val="28"/>
-          <w:szCs w:val="28"/>
+          <w:highlight w:val="yellow"/>
+        </w:rPr>
+      </w:pPr>
+      <w:r>
+        <w:rPr>
+          <w:rFonts w:ascii="Times New Roman" w:hAnsi="Times New Roman" w:cs="Times New Roman"/>
+          <w:sz w:val="28"/>
+          <w:szCs w:val="28"/>
+          <w:highlight w:val="yellow"/>
         </w:rPr>
         <w:t xml:space="preserve">Добавление категории к подписке </w:t>
       </w:r>
@@ -1840,13 +1985,15 @@
           <w:rFonts w:ascii="Times New Roman" w:hAnsi="Times New Roman" w:cs="Times New Roman"/>
           <w:sz w:val="28"/>
           <w:szCs w:val="28"/>
-        </w:rPr>
-      </w:pPr>
-      <w:r>
-        <w:rPr>
-          <w:rFonts w:ascii="Times New Roman" w:hAnsi="Times New Roman" w:cs="Times New Roman"/>
-          <w:sz w:val="28"/>
-          <w:szCs w:val="28"/>
+          <w:highlight w:val="yellow"/>
+        </w:rPr>
+      </w:pPr>
+      <w:r>
+        <w:rPr>
+          <w:rFonts w:ascii="Times New Roman" w:hAnsi="Times New Roman" w:cs="Times New Roman"/>
+          <w:sz w:val="28"/>
+          <w:szCs w:val="28"/>
+          <w:highlight w:val="yellow"/>
         </w:rPr>
         <w:t xml:space="preserve">Удаление категории </w:t>
       </w:r>
@@ -1911,13 +2058,15 @@
           <w:rFonts w:ascii="Times New Roman" w:hAnsi="Times New Roman" w:cs="Times New Roman"/>
           <w:sz w:val="28"/>
           <w:szCs w:val="28"/>
-        </w:rPr>
-      </w:pPr>
-      <w:r>
-        <w:rPr>
-          <w:rFonts w:ascii="Times New Roman" w:hAnsi="Times New Roman" w:cs="Times New Roman"/>
-          <w:sz w:val="28"/>
-          <w:szCs w:val="28"/>
+          <w:highlight w:val="yellow"/>
+        </w:rPr>
+      </w:pPr>
+      <w:r>
+        <w:rPr>
+          <w:rFonts w:ascii="Times New Roman" w:hAnsi="Times New Roman" w:cs="Times New Roman"/>
+          <w:sz w:val="28"/>
+          <w:szCs w:val="28"/>
+          <w:highlight w:val="yellow"/>
         </w:rPr>
         <w:t xml:space="preserve">Получение категорий подписки </w:t>
       </w:r>
@@ -2003,13 +2152,15 @@
           <w:rFonts w:ascii="Times New Roman" w:hAnsi="Times New Roman" w:cs="Times New Roman"/>
           <w:sz w:val="28"/>
           <w:szCs w:val="28"/>
-        </w:rPr>
-      </w:pPr>
-      <w:r>
-        <w:rPr>
-          <w:rFonts w:ascii="Times New Roman" w:hAnsi="Times New Roman" w:cs="Times New Roman"/>
-          <w:sz w:val="28"/>
-          <w:szCs w:val="28"/>
+          <w:highlight w:val="yellow"/>
+        </w:rPr>
+      </w:pPr>
+      <w:r>
+        <w:rPr>
+          <w:rFonts w:ascii="Times New Roman" w:hAnsi="Times New Roman" w:cs="Times New Roman"/>
+          <w:sz w:val="28"/>
+          <w:szCs w:val="28"/>
+          <w:highlight w:val="yellow"/>
         </w:rPr>
         <w:t xml:space="preserve">Отметка подписки как оплаченной </w:t>
       </w:r>
@@ -2074,13 +2225,15 @@
           <w:rFonts w:ascii="Times New Roman" w:hAnsi="Times New Roman" w:cs="Times New Roman"/>
           <w:sz w:val="28"/>
           <w:szCs w:val="28"/>
-        </w:rPr>
-      </w:pPr>
-      <w:r>
-        <w:rPr>
-          <w:rFonts w:ascii="Times New Roman" w:hAnsi="Times New Roman" w:cs="Times New Roman"/>
-          <w:sz w:val="28"/>
-          <w:szCs w:val="28"/>
+          <w:highlight w:val="yellow"/>
+        </w:rPr>
+      </w:pPr>
+      <w:r>
+        <w:rPr>
+          <w:rFonts w:ascii="Times New Roman" w:hAnsi="Times New Roman" w:cs="Times New Roman"/>
+          <w:sz w:val="28"/>
+          <w:szCs w:val="28"/>
+          <w:highlight w:val="yellow"/>
         </w:rPr>
         <w:t xml:space="preserve">Создание записи о платеже </w:t>
       </w:r>
@@ -2145,15 +2298,37 @@
           <w:rFonts w:ascii="Times New Roman" w:hAnsi="Times New Roman" w:cs="Times New Roman"/>
           <w:sz w:val="28"/>
           <w:szCs w:val="28"/>
-        </w:rPr>
-      </w:pPr>
-      <w:r>
-        <w:rPr>
-          <w:rFonts w:ascii="Times New Roman" w:hAnsi="Times New Roman" w:cs="Times New Roman"/>
-          <w:sz w:val="28"/>
-          <w:szCs w:val="28"/>
-        </w:rPr>
-        <w:t xml:space="preserve">Обновление next_payment_at после оплаты </w:t>
+          <w:highlight w:val="yellow"/>
+        </w:rPr>
+      </w:pPr>
+      <w:r>
+        <w:rPr>
+          <w:rFonts w:ascii="Times New Roman" w:hAnsi="Times New Roman" w:cs="Times New Roman"/>
+          <w:sz w:val="28"/>
+          <w:szCs w:val="28"/>
+          <w:highlight w:val="yellow"/>
+        </w:rPr>
+        <w:t xml:space="preserve">Обновление </w:t>
+      </w:r>
+      <w:proofErr w:type="spellStart"/>
+      <w:r>
+        <w:rPr>
+          <w:rFonts w:ascii="Times New Roman" w:hAnsi="Times New Roman" w:cs="Times New Roman"/>
+          <w:sz w:val="28"/>
+          <w:szCs w:val="28"/>
+          <w:highlight w:val="yellow"/>
+        </w:rPr>
+        <w:t>next_payment_at</w:t>
+      </w:r>
+      <w:proofErr w:type="spellEnd"/>
+      <w:r>
+        <w:rPr>
+          <w:rFonts w:ascii="Times New Roman" w:hAnsi="Times New Roman" w:cs="Times New Roman"/>
+          <w:sz w:val="28"/>
+          <w:szCs w:val="28"/>
+          <w:highlight w:val="yellow"/>
+        </w:rPr>
+        <w:t xml:space="preserve"> после оплаты </w:t>
       </w:r>
       <w:r>
         <w:rPr>
@@ -2238,13 +2413,15 @@
           <w:rFonts w:ascii="Times New Roman" w:hAnsi="Times New Roman" w:cs="Times New Roman"/>
           <w:sz w:val="28"/>
           <w:szCs w:val="28"/>
-        </w:rPr>
-      </w:pPr>
-      <w:r>
-        <w:rPr>
-          <w:rFonts w:ascii="Times New Roman" w:hAnsi="Times New Roman" w:cs="Times New Roman"/>
-          <w:sz w:val="28"/>
-          <w:szCs w:val="28"/>
+          <w:highlight w:val="yellow"/>
+        </w:rPr>
+      </w:pPr>
+      <w:r>
+        <w:rPr>
+          <w:rFonts w:ascii="Times New Roman" w:hAnsi="Times New Roman" w:cs="Times New Roman"/>
+          <w:sz w:val="28"/>
+          <w:szCs w:val="28"/>
+          <w:highlight w:val="yellow"/>
         </w:rPr>
         <w:t xml:space="preserve">Настроить Redis и BullMQ </w:t>
       </w:r>
@@ -2309,13 +2486,15 @@
           <w:rFonts w:ascii="Times New Roman" w:hAnsi="Times New Roman" w:cs="Times New Roman"/>
           <w:sz w:val="28"/>
           <w:szCs w:val="28"/>
-        </w:rPr>
-      </w:pPr>
-      <w:r>
-        <w:rPr>
-          <w:rFonts w:ascii="Times New Roman" w:hAnsi="Times New Roman" w:cs="Times New Roman"/>
-          <w:sz w:val="28"/>
-          <w:szCs w:val="28"/>
+          <w:highlight w:val="yellow"/>
+        </w:rPr>
+      </w:pPr>
+      <w:r>
+        <w:rPr>
+          <w:rFonts w:ascii="Times New Roman" w:hAnsi="Times New Roman" w:cs="Times New Roman"/>
+          <w:sz w:val="28"/>
+          <w:szCs w:val="28"/>
+          <w:highlight w:val="yellow"/>
         </w:rPr>
         <w:t xml:space="preserve">Реализовать очередь уведомлений </w:t>
       </w:r>
@@ -2380,13 +2559,15 @@
           <w:rFonts w:ascii="Times New Roman" w:hAnsi="Times New Roman" w:cs="Times New Roman"/>
           <w:sz w:val="28"/>
           <w:szCs w:val="28"/>
-        </w:rPr>
-      </w:pPr>
-      <w:r>
-        <w:rPr>
-          <w:rFonts w:ascii="Times New Roman" w:hAnsi="Times New Roman" w:cs="Times New Roman"/>
-          <w:sz w:val="28"/>
-          <w:szCs w:val="28"/>
+          <w:highlight w:val="yellow"/>
+        </w:rPr>
+      </w:pPr>
+      <w:r>
+        <w:rPr>
+          <w:rFonts w:ascii="Times New Roman" w:hAnsi="Times New Roman" w:cs="Times New Roman"/>
+          <w:sz w:val="28"/>
+          <w:szCs w:val="28"/>
+          <w:highlight w:val="yellow"/>
         </w:rPr>
         <w:t xml:space="preserve">Реализовать создание уведомлений </w:t>
       </w:r>
@@ -2451,13 +2632,15 @@
           <w:rFonts w:ascii="Times New Roman" w:hAnsi="Times New Roman" w:cs="Times New Roman"/>
           <w:sz w:val="28"/>
           <w:szCs w:val="28"/>
-        </w:rPr>
-      </w:pPr>
-      <w:r>
-        <w:rPr>
-          <w:rFonts w:ascii="Times New Roman" w:hAnsi="Times New Roman" w:cs="Times New Roman"/>
-          <w:sz w:val="28"/>
-          <w:szCs w:val="28"/>
+          <w:highlight w:val="yellow"/>
+        </w:rPr>
+      </w:pPr>
+      <w:r>
+        <w:rPr>
+          <w:rFonts w:ascii="Times New Roman" w:hAnsi="Times New Roman" w:cs="Times New Roman"/>
+          <w:sz w:val="28"/>
+          <w:szCs w:val="28"/>
+          <w:highlight w:val="yellow"/>
         </w:rPr>
         <w:t xml:space="preserve">Реализовать получение уведомлений </w:t>
       </w:r>
@@ -2522,13 +2705,15 @@
           <w:rFonts w:ascii="Times New Roman" w:hAnsi="Times New Roman" w:cs="Times New Roman"/>
           <w:sz w:val="28"/>
           <w:szCs w:val="28"/>
-        </w:rPr>
-      </w:pPr>
-      <w:r>
-        <w:rPr>
-          <w:rFonts w:ascii="Times New Roman" w:hAnsi="Times New Roman" w:cs="Times New Roman"/>
-          <w:sz w:val="28"/>
-          <w:szCs w:val="28"/>
+          <w:highlight w:val="yellow"/>
+        </w:rPr>
+      </w:pPr>
+      <w:r>
+        <w:rPr>
+          <w:rFonts w:ascii="Times New Roman" w:hAnsi="Times New Roman" w:cs="Times New Roman"/>
+          <w:sz w:val="28"/>
+          <w:szCs w:val="28"/>
+          <w:highlight w:val="yellow"/>
         </w:rPr>
         <w:t xml:space="preserve">Реализовать отметку уведомления как прочитанного </w:t>
       </w:r>
@@ -2593,13 +2778,15 @@
           <w:rFonts w:ascii="Times New Roman" w:hAnsi="Times New Roman" w:cs="Times New Roman"/>
           <w:sz w:val="28"/>
           <w:szCs w:val="28"/>
-        </w:rPr>
-      </w:pPr>
-      <w:r>
-        <w:rPr>
-          <w:rFonts w:ascii="Times New Roman" w:hAnsi="Times New Roman" w:cs="Times New Roman"/>
-          <w:sz w:val="28"/>
-          <w:szCs w:val="28"/>
+          <w:highlight w:val="yellow"/>
+        </w:rPr>
+      </w:pPr>
+      <w:r>
+        <w:rPr>
+          <w:rFonts w:ascii="Times New Roman" w:hAnsi="Times New Roman" w:cs="Times New Roman"/>
+          <w:sz w:val="28"/>
+          <w:szCs w:val="28"/>
+          <w:highlight w:val="yellow"/>
         </w:rPr>
         <w:t xml:space="preserve">Реализовать удаление уведомлений </w:t>
       </w:r>
@@ -2664,15 +2851,37 @@
           <w:rFonts w:ascii="Times New Roman" w:hAnsi="Times New Roman" w:cs="Times New Roman"/>
           <w:sz w:val="28"/>
           <w:szCs w:val="28"/>
-        </w:rPr>
-      </w:pPr>
-      <w:r>
-        <w:rPr>
-          <w:rFonts w:ascii="Times New Roman" w:hAnsi="Times New Roman" w:cs="Times New Roman"/>
-          <w:sz w:val="28"/>
-          <w:szCs w:val="28"/>
-        </w:rPr>
-        <w:t xml:space="preserve">Реализовать фоновую задачу проверки подписок (cron) </w:t>
+          <w:highlight w:val="yellow"/>
+        </w:rPr>
+      </w:pPr>
+      <w:r>
+        <w:rPr>
+          <w:rFonts w:ascii="Times New Roman" w:hAnsi="Times New Roman" w:cs="Times New Roman"/>
+          <w:sz w:val="28"/>
+          <w:szCs w:val="28"/>
+          <w:highlight w:val="yellow"/>
+        </w:rPr>
+        <w:t>Реализовать фоновую задачу проверки подписок (</w:t>
+      </w:r>
+      <w:proofErr w:type="spellStart"/>
+      <w:r>
+        <w:rPr>
+          <w:rFonts w:ascii="Times New Roman" w:hAnsi="Times New Roman" w:cs="Times New Roman"/>
+          <w:sz w:val="28"/>
+          <w:szCs w:val="28"/>
+          <w:highlight w:val="yellow"/>
+        </w:rPr>
+        <w:t>cron</w:t>
+      </w:r>
+      <w:proofErr w:type="spellEnd"/>
+      <w:r>
+        <w:rPr>
+          <w:rFonts w:ascii="Times New Roman" w:hAnsi="Times New Roman" w:cs="Times New Roman"/>
+          <w:sz w:val="28"/>
+          <w:szCs w:val="28"/>
+          <w:highlight w:val="yellow"/>
+        </w:rPr>
+        <w:t xml:space="preserve">) </w:t>
       </w:r>
       <w:r>
         <w:rPr>
@@ -2735,13 +2944,15 @@
           <w:rFonts w:ascii="Times New Roman" w:hAnsi="Times New Roman" w:cs="Times New Roman"/>
           <w:sz w:val="28"/>
           <w:szCs w:val="28"/>
-        </w:rPr>
-      </w:pPr>
-      <w:r>
-        <w:rPr>
-          <w:rFonts w:ascii="Times New Roman" w:hAnsi="Times New Roman" w:cs="Times New Roman"/>
-          <w:sz w:val="28"/>
-          <w:szCs w:val="28"/>
+          <w:highlight w:val="yellow"/>
+        </w:rPr>
+      </w:pPr>
+      <w:r>
+        <w:rPr>
+          <w:rFonts w:ascii="Times New Roman" w:hAnsi="Times New Roman" w:cs="Times New Roman"/>
+          <w:sz w:val="28"/>
+          <w:szCs w:val="28"/>
+          <w:highlight w:val="yellow"/>
         </w:rPr>
         <w:t xml:space="preserve">Реализовать автоматическое создание уведомлений о предстоящих платежах </w:t>
       </w:r>
@@ -2827,13 +3038,15 @@
           <w:rFonts w:ascii="Times New Roman" w:hAnsi="Times New Roman" w:cs="Times New Roman"/>
           <w:sz w:val="28"/>
           <w:szCs w:val="28"/>
-        </w:rPr>
-      </w:pPr>
-      <w:r>
-        <w:rPr>
-          <w:rFonts w:ascii="Times New Roman" w:hAnsi="Times New Roman" w:cs="Times New Roman"/>
-          <w:sz w:val="28"/>
-          <w:szCs w:val="28"/>
+          <w:highlight w:val="yellow"/>
+        </w:rPr>
+      </w:pPr>
+      <w:r>
+        <w:rPr>
+          <w:rFonts w:ascii="Times New Roman" w:hAnsi="Times New Roman" w:cs="Times New Roman"/>
+          <w:sz w:val="28"/>
+          <w:szCs w:val="28"/>
+          <w:highlight w:val="yellow"/>
         </w:rPr>
         <w:t xml:space="preserve">Поиск подписок по названию </w:t>
       </w:r>
@@ -2898,13 +3111,15 @@
           <w:rFonts w:ascii="Times New Roman" w:hAnsi="Times New Roman" w:cs="Times New Roman"/>
           <w:sz w:val="28"/>
           <w:szCs w:val="28"/>
-        </w:rPr>
-      </w:pPr>
-      <w:r>
-        <w:rPr>
-          <w:rFonts w:ascii="Times New Roman" w:hAnsi="Times New Roman" w:cs="Times New Roman"/>
-          <w:sz w:val="28"/>
-          <w:szCs w:val="28"/>
+          <w:highlight w:val="yellow"/>
+        </w:rPr>
+      </w:pPr>
+      <w:r>
+        <w:rPr>
+          <w:rFonts w:ascii="Times New Roman" w:hAnsi="Times New Roman" w:cs="Times New Roman"/>
+          <w:sz w:val="28"/>
+          <w:szCs w:val="28"/>
+          <w:highlight w:val="yellow"/>
         </w:rPr>
         <w:t xml:space="preserve">Фильтрация по статусу </w:t>
       </w:r>
@@ -2969,13 +3184,15 @@
           <w:rFonts w:ascii="Times New Roman" w:hAnsi="Times New Roman" w:cs="Times New Roman"/>
           <w:sz w:val="28"/>
           <w:szCs w:val="28"/>
-        </w:rPr>
-      </w:pPr>
-      <w:r>
-        <w:rPr>
-          <w:rFonts w:ascii="Times New Roman" w:hAnsi="Times New Roman" w:cs="Times New Roman"/>
-          <w:sz w:val="28"/>
-          <w:szCs w:val="28"/>
+          <w:highlight w:val="yellow"/>
+        </w:rPr>
+      </w:pPr>
+      <w:r>
+        <w:rPr>
+          <w:rFonts w:ascii="Times New Roman" w:hAnsi="Times New Roman" w:cs="Times New Roman"/>
+          <w:sz w:val="28"/>
+          <w:szCs w:val="28"/>
+          <w:highlight w:val="yellow"/>
         </w:rPr>
         <w:t>Фильтрация по категории</w:t>
       </w:r>
@@ -2984,6 +3201,7 @@
           <w:rFonts w:ascii="Times New Roman" w:hAnsi="Times New Roman" w:cs="Times New Roman"/>
           <w:sz w:val="28"/>
           <w:szCs w:val="28"/>
+          <w:highlight w:val="yellow"/>
           <w:lang w:val="en-US"/>
         </w:rPr>
         <w:t xml:space="preserve"> </w:t>
@@ -3043,6 +3261,7 @@
           <w:rFonts w:ascii="Times New Roman" w:hAnsi="Times New Roman" w:cs="Times New Roman"/>
           <w:sz w:val="28"/>
           <w:szCs w:val="28"/>
+          <w:highlight w:val="yellow"/>
         </w:rPr>
         <w:t xml:space="preserve"> </w:t>
       </w:r>
@@ -3057,6 +3276,7 @@
           <w:rFonts w:ascii="Times New Roman" w:hAnsi="Times New Roman" w:cs="Times New Roman"/>
           <w:sz w:val="28"/>
           <w:szCs w:val="28"/>
+          <w:highlight w:val="yellow"/>
           <w:lang w:val="en-US"/>
         </w:rPr>
       </w:pPr>
@@ -3065,6 +3285,7 @@
           <w:rFonts w:ascii="Times New Roman" w:hAnsi="Times New Roman" w:cs="Times New Roman"/>
           <w:sz w:val="28"/>
           <w:szCs w:val="28"/>
+          <w:highlight w:val="yellow"/>
         </w:rPr>
         <w:t>Сортировка</w:t>
       </w:r>
@@ -3073,6 +3294,7 @@
           <w:rFonts w:ascii="Times New Roman" w:hAnsi="Times New Roman" w:cs="Times New Roman"/>
           <w:sz w:val="28"/>
           <w:szCs w:val="28"/>
+          <w:highlight w:val="yellow"/>
           <w:lang w:val="en-US"/>
         </w:rPr>
         <w:t xml:space="preserve"> </w:t>
@@ -3082,6 +3304,7 @@
           <w:rFonts w:ascii="Times New Roman" w:hAnsi="Times New Roman" w:cs="Times New Roman"/>
           <w:sz w:val="28"/>
           <w:szCs w:val="28"/>
+          <w:highlight w:val="yellow"/>
         </w:rPr>
         <w:t>по</w:t>
       </w:r>
@@ -3090,9 +3313,32 @@
           <w:rFonts w:ascii="Times New Roman" w:hAnsi="Times New Roman" w:cs="Times New Roman"/>
           <w:sz w:val="28"/>
           <w:szCs w:val="28"/>
+          <w:highlight w:val="yellow"/>
           <w:lang w:val="en-US"/>
         </w:rPr>
-        <w:t xml:space="preserve"> next_payment_at </w:t>
+        <w:t xml:space="preserve"> </w:t>
+      </w:r>
+      <w:proofErr w:type="spellStart"/>
+      <w:r>
+        <w:rPr>
+          <w:rFonts w:ascii="Times New Roman" w:hAnsi="Times New Roman" w:cs="Times New Roman"/>
+          <w:sz w:val="28"/>
+          <w:szCs w:val="28"/>
+          <w:highlight w:val="yellow"/>
+          <w:lang w:val="en-US"/>
+        </w:rPr>
+        <w:t>next_payment_at</w:t>
+      </w:r>
+      <w:proofErr w:type="spellEnd"/>
+      <w:r>
+        <w:rPr>
+          <w:rFonts w:ascii="Times New Roman" w:hAnsi="Times New Roman" w:cs="Times New Roman"/>
+          <w:sz w:val="28"/>
+          <w:szCs w:val="28"/>
+          <w:highlight w:val="yellow"/>
+          <w:lang w:val="en-US"/>
+        </w:rPr>
+        <w:t xml:space="preserve"> </w:t>
       </w:r>
       <w:r>
         <w:rPr>
@@ -3155,13 +3401,15 @@
           <w:rFonts w:ascii="Times New Roman" w:hAnsi="Times New Roman" w:cs="Times New Roman"/>
           <w:sz w:val="28"/>
           <w:szCs w:val="28"/>
-        </w:rPr>
-      </w:pPr>
-      <w:r>
-        <w:rPr>
-          <w:rFonts w:ascii="Times New Roman" w:hAnsi="Times New Roman" w:cs="Times New Roman"/>
-          <w:sz w:val="28"/>
-          <w:szCs w:val="28"/>
+          <w:highlight w:val="yellow"/>
+        </w:rPr>
+      </w:pPr>
+      <w:r>
+        <w:rPr>
+          <w:rFonts w:ascii="Times New Roman" w:hAnsi="Times New Roman" w:cs="Times New Roman"/>
+          <w:sz w:val="28"/>
+          <w:szCs w:val="28"/>
+          <w:highlight w:val="yellow"/>
         </w:rPr>
         <w:t xml:space="preserve">Сортировка по стоимости </w:t>
       </w:r>
@@ -3247,15 +3495,85 @@
           <w:rFonts w:ascii="Times New Roman" w:hAnsi="Times New Roman" w:cs="Times New Roman"/>
           <w:sz w:val="28"/>
           <w:szCs w:val="28"/>
-        </w:rPr>
-      </w:pPr>
-      <w:r>
-        <w:rPr>
-          <w:rFonts w:ascii="Times New Roman" w:hAnsi="Times New Roman" w:cs="Times New Roman"/>
-          <w:sz w:val="28"/>
-          <w:szCs w:val="28"/>
-        </w:rPr>
-        <w:t xml:space="preserve">Расчёт текущих расходов </w:t>
+          <w:highlight w:val="yellow"/>
+        </w:rPr>
+      </w:pPr>
+      <w:r>
+        <w:rPr>
+          <w:rFonts w:ascii="Times New Roman" w:hAnsi="Times New Roman" w:cs="Times New Roman"/>
+          <w:sz w:val="28"/>
+          <w:szCs w:val="28"/>
+          <w:highlight w:val="yellow"/>
+        </w:rPr>
+        <w:t>Расчёт текущих расходов</w:t>
+      </w:r>
+      <w:r>
+        <w:rPr>
+          <w:rFonts w:ascii="Times New Roman" w:hAnsi="Times New Roman" w:cs="Times New Roman"/>
+          <w:sz w:val="28"/>
+          <w:szCs w:val="28"/>
+          <w:highlight w:val="yellow"/>
+        </w:rPr>
+        <w:t xml:space="preserve"> </w:t>
+      </w:r>
+      <w:r>
+        <w:rPr>
+          <w:rFonts w:ascii="Times New Roman" w:hAnsi="Times New Roman" w:cs="Times New Roman"/>
+          <w:sz w:val="28"/>
+          <w:szCs w:val="28"/>
+          <w:highlight w:val="yellow"/>
+        </w:rPr>
+        <w:t xml:space="preserve"> </w:t>
+      </w:r>
+      <w:r>
+        <w:rPr>
+          <w:rFonts w:ascii="Times New Roman" w:hAnsi="Times New Roman" w:cs="Times New Roman"/>
+          <w:noProof/>
+          <w:sz w:val="28"/>
+          <w:szCs w:val="28"/>
+          <w:highlight w:val="yellow"/>
+        </w:rPr>
+        <w:drawing>
+          <wp:inline distT="0" distB="0" distL="0" distR="0" wp14:anchorId="112FADA4" wp14:editId="6D2521C6">
+            <wp:extent cx="182880" cy="182880"/>
+            <wp:effectExtent l="0" t="0" r="7620" b="7620"/>
+            <wp:docPr id="562518717" name="Рисунок 1" descr="Значок &quot;Галочка&quot; контур"/>
+            <wp:cNvGraphicFramePr>
+              <a:graphicFrameLocks xmlns:a="http://schemas.openxmlformats.org/drawingml/2006/main" noChangeAspect="1"/>
+            </wp:cNvGraphicFramePr>
+            <a:graphic xmlns:a="http://schemas.openxmlformats.org/drawingml/2006/main">
+              <a:graphicData uri="http://schemas.openxmlformats.org/drawingml/2006/picture">
+                <pic:pic xmlns:pic="http://schemas.openxmlformats.org/drawingml/2006/picture">
+                  <pic:nvPicPr>
+                    <pic:cNvPr id="914769617" name="Рисунок 914769617" descr="Значок &quot;Галочка&quot; контур"/>
+                    <pic:cNvPicPr/>
+                  </pic:nvPicPr>
+                  <pic:blipFill>
+                    <a:blip r:embed="rId6">
+                      <a:extLst>
+                        <a:ext uri="{96DAC541-7B7A-43D3-8B79-37D633B846F1}">
+                          <asvg:svgBlip xmlns:asvg="http://schemas.microsoft.com/office/drawing/2016/SVG/main" r:embed="rId7"/>
+                        </a:ext>
+                      </a:extLst>
+                    </a:blip>
+                    <a:stretch>
+                      <a:fillRect/>
+                    </a:stretch>
+                  </pic:blipFill>
+                  <pic:spPr>
+                    <a:xfrm>
+                      <a:off x="0" y="0"/>
+                      <a:ext cx="182880" cy="182880"/>
+                    </a:xfrm>
+                    <a:prstGeom prst="rect">
+                      <a:avLst/>
+                    </a:prstGeom>
+                  </pic:spPr>
+                </pic:pic>
+              </a:graphicData>
+            </a:graphic>
+          </wp:inline>
+        </w:drawing>
       </w:r>
     </w:p>
     <w:p>
@@ -3268,16 +3586,68 @@
           <w:rFonts w:ascii="Times New Roman" w:hAnsi="Times New Roman" w:cs="Times New Roman"/>
           <w:sz w:val="28"/>
           <w:szCs w:val="28"/>
-        </w:rPr>
-      </w:pPr>
-      <w:r>
-        <w:rPr>
-          <w:rFonts w:ascii="Times New Roman" w:hAnsi="Times New Roman" w:cs="Times New Roman"/>
-          <w:sz w:val="28"/>
-          <w:szCs w:val="28"/>
+          <w:highlight w:val="yellow"/>
+        </w:rPr>
+      </w:pPr>
+      <w:r>
+        <w:rPr>
+          <w:rFonts w:ascii="Times New Roman" w:hAnsi="Times New Roman" w:cs="Times New Roman"/>
+          <w:sz w:val="28"/>
+          <w:szCs w:val="28"/>
+          <w:highlight w:val="yellow"/>
         </w:rPr>
         <w:lastRenderedPageBreak/>
         <w:t xml:space="preserve">Расчёт расходов за месяц </w:t>
+      </w:r>
+      <w:r>
+        <w:rPr>
+          <w:rFonts w:ascii="Times New Roman" w:hAnsi="Times New Roman" w:cs="Times New Roman"/>
+          <w:noProof/>
+          <w:sz w:val="28"/>
+          <w:szCs w:val="28"/>
+          <w:highlight w:val="yellow"/>
+        </w:rPr>
+        <w:drawing>
+          <wp:inline distT="0" distB="0" distL="0" distR="0" wp14:anchorId="1736EB8F" wp14:editId="30F7812D">
+            <wp:extent cx="182880" cy="182880"/>
+            <wp:effectExtent l="0" t="0" r="7620" b="7620"/>
+            <wp:docPr id="1353370297" name="Рисунок 1" descr="Значок &quot;Галочка&quot; контур"/>
+            <wp:cNvGraphicFramePr>
+              <a:graphicFrameLocks xmlns:a="http://schemas.openxmlformats.org/drawingml/2006/main" noChangeAspect="1"/>
+            </wp:cNvGraphicFramePr>
+            <a:graphic xmlns:a="http://schemas.openxmlformats.org/drawingml/2006/main">
+              <a:graphicData uri="http://schemas.openxmlformats.org/drawingml/2006/picture">
+                <pic:pic xmlns:pic="http://schemas.openxmlformats.org/drawingml/2006/picture">
+                  <pic:nvPicPr>
+                    <pic:cNvPr id="914769617" name="Рисунок 914769617" descr="Значок &quot;Галочка&quot; контур"/>
+                    <pic:cNvPicPr/>
+                  </pic:nvPicPr>
+                  <pic:blipFill>
+                    <a:blip r:embed="rId6">
+                      <a:extLst>
+                        <a:ext uri="{96DAC541-7B7A-43D3-8B79-37D633B846F1}">
+                          <asvg:svgBlip xmlns:asvg="http://schemas.microsoft.com/office/drawing/2016/SVG/main" r:embed="rId7"/>
+                        </a:ext>
+                      </a:extLst>
+                    </a:blip>
+                    <a:stretch>
+                      <a:fillRect/>
+                    </a:stretch>
+                  </pic:blipFill>
+                  <pic:spPr>
+                    <a:xfrm>
+                      <a:off x="0" y="0"/>
+                      <a:ext cx="182880" cy="182880"/>
+                    </a:xfrm>
+                    <a:prstGeom prst="rect">
+                      <a:avLst/>
+                    </a:prstGeom>
+                  </pic:spPr>
+                </pic:pic>
+              </a:graphicData>
+            </a:graphic>
+          </wp:inline>
+        </w:drawing>
       </w:r>
     </w:p>
     <w:p>
@@ -3290,15 +3660,67 @@
           <w:rFonts w:ascii="Times New Roman" w:hAnsi="Times New Roman" w:cs="Times New Roman"/>
           <w:sz w:val="28"/>
           <w:szCs w:val="28"/>
-        </w:rPr>
-      </w:pPr>
-      <w:r>
-        <w:rPr>
-          <w:rFonts w:ascii="Times New Roman" w:hAnsi="Times New Roman" w:cs="Times New Roman"/>
-          <w:sz w:val="28"/>
-          <w:szCs w:val="28"/>
+          <w:highlight w:val="yellow"/>
+        </w:rPr>
+      </w:pPr>
+      <w:r>
+        <w:rPr>
+          <w:rFonts w:ascii="Times New Roman" w:hAnsi="Times New Roman" w:cs="Times New Roman"/>
+          <w:sz w:val="28"/>
+          <w:szCs w:val="28"/>
+          <w:highlight w:val="yellow"/>
         </w:rPr>
         <w:t xml:space="preserve">Расчёт расходов за год </w:t>
+      </w:r>
+      <w:r>
+        <w:rPr>
+          <w:rFonts w:ascii="Times New Roman" w:hAnsi="Times New Roman" w:cs="Times New Roman"/>
+          <w:noProof/>
+          <w:sz w:val="28"/>
+          <w:szCs w:val="28"/>
+          <w:highlight w:val="yellow"/>
+        </w:rPr>
+        <w:drawing>
+          <wp:inline distT="0" distB="0" distL="0" distR="0" wp14:anchorId="10CC6C76" wp14:editId="0D69A949">
+            <wp:extent cx="182880" cy="182880"/>
+            <wp:effectExtent l="0" t="0" r="7620" b="7620"/>
+            <wp:docPr id="1750960922" name="Рисунок 1" descr="Значок &quot;Галочка&quot; контур"/>
+            <wp:cNvGraphicFramePr>
+              <a:graphicFrameLocks xmlns:a="http://schemas.openxmlformats.org/drawingml/2006/main" noChangeAspect="1"/>
+            </wp:cNvGraphicFramePr>
+            <a:graphic xmlns:a="http://schemas.openxmlformats.org/drawingml/2006/main">
+              <a:graphicData uri="http://schemas.openxmlformats.org/drawingml/2006/picture">
+                <pic:pic xmlns:pic="http://schemas.openxmlformats.org/drawingml/2006/picture">
+                  <pic:nvPicPr>
+                    <pic:cNvPr id="914769617" name="Рисунок 914769617" descr="Значок &quot;Галочка&quot; контур"/>
+                    <pic:cNvPicPr/>
+                  </pic:nvPicPr>
+                  <pic:blipFill>
+                    <a:blip r:embed="rId6">
+                      <a:extLst>
+                        <a:ext uri="{96DAC541-7B7A-43D3-8B79-37D633B846F1}">
+                          <asvg:svgBlip xmlns:asvg="http://schemas.microsoft.com/office/drawing/2016/SVG/main" r:embed="rId7"/>
+                        </a:ext>
+                      </a:extLst>
+                    </a:blip>
+                    <a:stretch>
+                      <a:fillRect/>
+                    </a:stretch>
+                  </pic:blipFill>
+                  <pic:spPr>
+                    <a:xfrm>
+                      <a:off x="0" y="0"/>
+                      <a:ext cx="182880" cy="182880"/>
+                    </a:xfrm>
+                    <a:prstGeom prst="rect">
+                      <a:avLst/>
+                    </a:prstGeom>
+                  </pic:spPr>
+                </pic:pic>
+              </a:graphicData>
+            </a:graphic>
+          </wp:inline>
+        </w:drawing>
       </w:r>
     </w:p>
     <w:p>
@@ -3311,15 +3733,85 @@
           <w:rFonts w:ascii="Times New Roman" w:hAnsi="Times New Roman" w:cs="Times New Roman"/>
           <w:sz w:val="28"/>
           <w:szCs w:val="28"/>
-        </w:rPr>
-      </w:pPr>
-      <w:r>
-        <w:rPr>
-          <w:rFonts w:ascii="Times New Roman" w:hAnsi="Times New Roman" w:cs="Times New Roman"/>
-          <w:sz w:val="28"/>
-          <w:szCs w:val="28"/>
-        </w:rPr>
-        <w:t xml:space="preserve">Получение ближайших платежей </w:t>
+          <w:highlight w:val="yellow"/>
+        </w:rPr>
+      </w:pPr>
+      <w:r>
+        <w:rPr>
+          <w:rFonts w:ascii="Times New Roman" w:hAnsi="Times New Roman" w:cs="Times New Roman"/>
+          <w:sz w:val="28"/>
+          <w:szCs w:val="28"/>
+          <w:highlight w:val="yellow"/>
+        </w:rPr>
+        <w:t>Расчёт расходов за</w:t>
+      </w:r>
+      <w:r>
+        <w:rPr>
+          <w:rFonts w:ascii="Times New Roman" w:hAnsi="Times New Roman" w:cs="Times New Roman"/>
+          <w:sz w:val="28"/>
+          <w:szCs w:val="28"/>
+          <w:highlight w:val="yellow"/>
+        </w:rPr>
+        <w:t xml:space="preserve"> полгода</w:t>
+      </w:r>
+      <w:r>
+        <w:rPr>
+          <w:rFonts w:ascii="Times New Roman" w:hAnsi="Times New Roman" w:cs="Times New Roman"/>
+          <w:sz w:val="28"/>
+          <w:szCs w:val="28"/>
+          <w:highlight w:val="yellow"/>
+        </w:rPr>
+        <w:t xml:space="preserve"> </w:t>
+      </w:r>
+      <w:r>
+        <w:rPr>
+          <w:rFonts w:ascii="Times New Roman" w:hAnsi="Times New Roman" w:cs="Times New Roman"/>
+          <w:noProof/>
+          <w:sz w:val="28"/>
+          <w:szCs w:val="28"/>
+          <w:highlight w:val="yellow"/>
+        </w:rPr>
+        <w:drawing>
+          <wp:inline distT="0" distB="0" distL="0" distR="0" wp14:anchorId="4BA41154" wp14:editId="70399051">
+            <wp:extent cx="182880" cy="182880"/>
+            <wp:effectExtent l="0" t="0" r="7620" b="7620"/>
+            <wp:docPr id="2056487982" name="Рисунок 1" descr="Значок &quot;Галочка&quot; контур"/>
+            <wp:cNvGraphicFramePr>
+              <a:graphicFrameLocks xmlns:a="http://schemas.openxmlformats.org/drawingml/2006/main" noChangeAspect="1"/>
+            </wp:cNvGraphicFramePr>
+            <a:graphic xmlns:a="http://schemas.openxmlformats.org/drawingml/2006/main">
+              <a:graphicData uri="http://schemas.openxmlformats.org/drawingml/2006/picture">
+                <pic:pic xmlns:pic="http://schemas.openxmlformats.org/drawingml/2006/picture">
+                  <pic:nvPicPr>
+                    <pic:cNvPr id="914769617" name="Рисунок 914769617" descr="Значок &quot;Галочка&quot; контур"/>
+                    <pic:cNvPicPr/>
+                  </pic:nvPicPr>
+                  <pic:blipFill>
+                    <a:blip r:embed="rId6">
+                      <a:extLst>
+                        <a:ext uri="{96DAC541-7B7A-43D3-8B79-37D633B846F1}">
+                          <asvg:svgBlip xmlns:asvg="http://schemas.microsoft.com/office/drawing/2016/SVG/main" r:embed="rId7"/>
+                        </a:ext>
+                      </a:extLst>
+                    </a:blip>
+                    <a:stretch>
+                      <a:fillRect/>
+                    </a:stretch>
+                  </pic:blipFill>
+                  <pic:spPr>
+                    <a:xfrm>
+                      <a:off x="0" y="0"/>
+                      <a:ext cx="182880" cy="182880"/>
+                    </a:xfrm>
+                    <a:prstGeom prst="rect">
+                      <a:avLst/>
+                    </a:prstGeom>
+                  </pic:spPr>
+                </pic:pic>
+              </a:graphicData>
+            </a:graphic>
+          </wp:inline>
+        </w:drawing>
       </w:r>
     </w:p>
     <w:p>
@@ -3332,25 +3824,169 @@
           <w:rFonts w:ascii="Times New Roman" w:hAnsi="Times New Roman" w:cs="Times New Roman"/>
           <w:sz w:val="28"/>
           <w:szCs w:val="28"/>
-        </w:rPr>
-      </w:pPr>
-      <w:r>
-        <w:rPr>
-          <w:rFonts w:ascii="Times New Roman" w:hAnsi="Times New Roman" w:cs="Times New Roman"/>
-          <w:sz w:val="28"/>
-          <w:szCs w:val="28"/>
-        </w:rPr>
-        <w:t xml:space="preserve">Агрегация расходов по категориям </w:t>
+          <w:highlight w:val="yellow"/>
+        </w:rPr>
+      </w:pPr>
+      <w:r>
+        <w:rPr>
+          <w:rFonts w:ascii="Times New Roman" w:hAnsi="Times New Roman" w:cs="Times New Roman"/>
+          <w:sz w:val="28"/>
+          <w:szCs w:val="28"/>
+          <w:highlight w:val="yellow"/>
+        </w:rPr>
+        <w:t>Расчёт расходов за</w:t>
+      </w:r>
+      <w:r>
+        <w:rPr>
+          <w:rFonts w:ascii="Times New Roman" w:hAnsi="Times New Roman" w:cs="Times New Roman"/>
+          <w:sz w:val="28"/>
+          <w:szCs w:val="28"/>
+          <w:highlight w:val="yellow"/>
+        </w:rPr>
+        <w:t xml:space="preserve"> квартал</w:t>
+      </w:r>
+      <w:r>
+        <w:rPr>
+          <w:rFonts w:ascii="Times New Roman" w:hAnsi="Times New Roman" w:cs="Times New Roman"/>
+          <w:sz w:val="28"/>
+          <w:szCs w:val="28"/>
+          <w:highlight w:val="yellow"/>
+        </w:rPr>
+        <w:t xml:space="preserve"> </w:t>
+      </w:r>
+      <w:r>
+        <w:rPr>
+          <w:rFonts w:ascii="Times New Roman" w:hAnsi="Times New Roman" w:cs="Times New Roman"/>
+          <w:noProof/>
+          <w:sz w:val="28"/>
+          <w:szCs w:val="28"/>
+          <w:highlight w:val="yellow"/>
+        </w:rPr>
+        <w:drawing>
+          <wp:inline distT="0" distB="0" distL="0" distR="0" wp14:anchorId="66FCC4F6" wp14:editId="0A1D11DF">
+            <wp:extent cx="182880" cy="182880"/>
+            <wp:effectExtent l="0" t="0" r="7620" b="7620"/>
+            <wp:docPr id="217739192" name="Рисунок 1" descr="Значок &quot;Галочка&quot; контур"/>
+            <wp:cNvGraphicFramePr>
+              <a:graphicFrameLocks xmlns:a="http://schemas.openxmlformats.org/drawingml/2006/main" noChangeAspect="1"/>
+            </wp:cNvGraphicFramePr>
+            <a:graphic xmlns:a="http://schemas.openxmlformats.org/drawingml/2006/main">
+              <a:graphicData uri="http://schemas.openxmlformats.org/drawingml/2006/picture">
+                <pic:pic xmlns:pic="http://schemas.openxmlformats.org/drawingml/2006/picture">
+                  <pic:nvPicPr>
+                    <pic:cNvPr id="914769617" name="Рисунок 914769617" descr="Значок &quot;Галочка&quot; контур"/>
+                    <pic:cNvPicPr/>
+                  </pic:nvPicPr>
+                  <pic:blipFill>
+                    <a:blip r:embed="rId6">
+                      <a:extLst>
+                        <a:ext uri="{96DAC541-7B7A-43D3-8B79-37D633B846F1}">
+                          <asvg:svgBlip xmlns:asvg="http://schemas.microsoft.com/office/drawing/2016/SVG/main" r:embed="rId7"/>
+                        </a:ext>
+                      </a:extLst>
+                    </a:blip>
+                    <a:stretch>
+                      <a:fillRect/>
+                    </a:stretch>
+                  </pic:blipFill>
+                  <pic:spPr>
+                    <a:xfrm>
+                      <a:off x="0" y="0"/>
+                      <a:ext cx="182880" cy="182880"/>
+                    </a:xfrm>
+                    <a:prstGeom prst="rect">
+                      <a:avLst/>
+                    </a:prstGeom>
+                  </pic:spPr>
+                </pic:pic>
+              </a:graphicData>
+            </a:graphic>
+          </wp:inline>
+        </w:drawing>
       </w:r>
     </w:p>
     <w:p>
       <w:pPr>
+        <w:numPr>
+          <w:ilvl w:val="0"/>
+          <w:numId w:val="19"/>
+        </w:numPr>
+        <w:rPr>
+          <w:rFonts w:ascii="Times New Roman" w:hAnsi="Times New Roman" w:cs="Times New Roman"/>
+          <w:sz w:val="28"/>
+          <w:szCs w:val="28"/>
+          <w:highlight w:val="yellow"/>
+        </w:rPr>
+      </w:pPr>
+      <w:r>
+        <w:rPr>
+          <w:rFonts w:ascii="Times New Roman" w:hAnsi="Times New Roman" w:cs="Times New Roman"/>
+          <w:sz w:val="28"/>
+          <w:szCs w:val="28"/>
+          <w:highlight w:val="yellow"/>
+        </w:rPr>
+        <w:t xml:space="preserve">Агрегация расходов по категориям </w:t>
+      </w:r>
+      <w:r>
+        <w:rPr>
+          <w:rFonts w:ascii="Times New Roman" w:hAnsi="Times New Roman" w:cs="Times New Roman"/>
+          <w:noProof/>
+          <w:sz w:val="28"/>
+          <w:szCs w:val="28"/>
+          <w:highlight w:val="yellow"/>
+        </w:rPr>
+        <w:drawing>
+          <wp:inline distT="0" distB="0" distL="0" distR="0" wp14:anchorId="28226953" wp14:editId="4B2F4C73">
+            <wp:extent cx="182880" cy="182880"/>
+            <wp:effectExtent l="0" t="0" r="7620" b="7620"/>
+            <wp:docPr id="1672905601" name="Рисунок 1" descr="Значок &quot;Галочка&quot; контур"/>
+            <wp:cNvGraphicFramePr>
+              <a:graphicFrameLocks xmlns:a="http://schemas.openxmlformats.org/drawingml/2006/main" noChangeAspect="1"/>
+            </wp:cNvGraphicFramePr>
+            <a:graphic xmlns:a="http://schemas.openxmlformats.org/drawingml/2006/main">
+              <a:graphicData uri="http://schemas.openxmlformats.org/drawingml/2006/picture">
+                <pic:pic xmlns:pic="http://schemas.openxmlformats.org/drawingml/2006/picture">
+                  <pic:nvPicPr>
+                    <pic:cNvPr id="914769617" name="Рисунок 914769617" descr="Значок &quot;Галочка&quot; контур"/>
+                    <pic:cNvPicPr/>
+                  </pic:nvPicPr>
+                  <pic:blipFill>
+                    <a:blip r:embed="rId6">
+                      <a:extLst>
+                        <a:ext uri="{96DAC541-7B7A-43D3-8B79-37D633B846F1}">
+                          <asvg:svgBlip xmlns:asvg="http://schemas.microsoft.com/office/drawing/2016/SVG/main" r:embed="rId7"/>
+                        </a:ext>
+                      </a:extLst>
+                    </a:blip>
+                    <a:stretch>
+                      <a:fillRect/>
+                    </a:stretch>
+                  </pic:blipFill>
+                  <pic:spPr>
+                    <a:xfrm>
+                      <a:off x="0" y="0"/>
+                      <a:ext cx="182880" cy="182880"/>
+                    </a:xfrm>
+                    <a:prstGeom prst="rect">
+                      <a:avLst/>
+                    </a:prstGeom>
+                  </pic:spPr>
+                </pic:pic>
+              </a:graphicData>
+            </a:graphic>
+          </wp:inline>
+        </w:drawing>
+      </w:r>
+    </w:p>
+    <w:p>
+      <w:pPr>
         <w:rPr>
           <w:rFonts w:ascii="Times New Roman" w:hAnsi="Times New Roman" w:cs="Times New Roman"/>
           <w:b/>
           <w:bCs/>
           <w:sz w:val="28"/>
           <w:szCs w:val="28"/>
+          <w:lang w:val="en-US"/>
         </w:rPr>
       </w:pPr>
       <w:r>
@@ -3374,15 +4010,37 @@
           <w:rFonts w:ascii="Times New Roman" w:hAnsi="Times New Roman" w:cs="Times New Roman"/>
           <w:sz w:val="28"/>
           <w:szCs w:val="28"/>
-        </w:rPr>
-      </w:pPr>
-      <w:r>
-        <w:rPr>
-          <w:rFonts w:ascii="Times New Roman" w:hAnsi="Times New Roman" w:cs="Times New Roman"/>
-          <w:sz w:val="28"/>
-          <w:szCs w:val="28"/>
-        </w:rPr>
-        <w:t xml:space="preserve">Проверка доступа к данным (ownership) </w:t>
+          <w:highlight w:val="yellow"/>
+        </w:rPr>
+      </w:pPr>
+      <w:r>
+        <w:rPr>
+          <w:rFonts w:ascii="Times New Roman" w:hAnsi="Times New Roman" w:cs="Times New Roman"/>
+          <w:sz w:val="28"/>
+          <w:szCs w:val="28"/>
+          <w:highlight w:val="yellow"/>
+        </w:rPr>
+        <w:t>Проверка доступа к данным (</w:t>
+      </w:r>
+      <w:proofErr w:type="spellStart"/>
+      <w:r>
+        <w:rPr>
+          <w:rFonts w:ascii="Times New Roman" w:hAnsi="Times New Roman" w:cs="Times New Roman"/>
+          <w:sz w:val="28"/>
+          <w:szCs w:val="28"/>
+          <w:highlight w:val="yellow"/>
+        </w:rPr>
+        <w:t>ownership</w:t>
+      </w:r>
+      <w:proofErr w:type="spellEnd"/>
+      <w:r>
+        <w:rPr>
+          <w:rFonts w:ascii="Times New Roman" w:hAnsi="Times New Roman" w:cs="Times New Roman"/>
+          <w:sz w:val="28"/>
+          <w:szCs w:val="28"/>
+          <w:highlight w:val="yellow"/>
+        </w:rPr>
+        <w:t xml:space="preserve">) </w:t>
       </w:r>
     </w:p>
     <w:p>
@@ -3395,13 +4053,15 @@
           <w:rFonts w:ascii="Times New Roman" w:hAnsi="Times New Roman" w:cs="Times New Roman"/>
           <w:sz w:val="28"/>
           <w:szCs w:val="28"/>
-        </w:rPr>
-      </w:pPr>
-      <w:r>
-        <w:rPr>
-          <w:rFonts w:ascii="Times New Roman" w:hAnsi="Times New Roman" w:cs="Times New Roman"/>
-          <w:sz w:val="28"/>
-          <w:szCs w:val="28"/>
+          <w:highlight w:val="yellow"/>
+        </w:rPr>
+      </w:pPr>
+      <w:r>
+        <w:rPr>
+          <w:rFonts w:ascii="Times New Roman" w:hAnsi="Times New Roman" w:cs="Times New Roman"/>
+          <w:sz w:val="28"/>
+          <w:szCs w:val="28"/>
+          <w:highlight w:val="yellow"/>
         </w:rPr>
         <w:t xml:space="preserve">Обработка ошибок </w:t>
       </w:r>
@@ -3416,13 +4076,15 @@
           <w:rFonts w:ascii="Times New Roman" w:hAnsi="Times New Roman" w:cs="Times New Roman"/>
           <w:sz w:val="28"/>
           <w:szCs w:val="28"/>
-        </w:rPr>
-      </w:pPr>
-      <w:r>
-        <w:rPr>
-          <w:rFonts w:ascii="Times New Roman" w:hAnsi="Times New Roman" w:cs="Times New Roman"/>
-          <w:sz w:val="28"/>
-          <w:szCs w:val="28"/>
+          <w:highlight w:val="yellow"/>
+        </w:rPr>
+      </w:pPr>
+      <w:r>
+        <w:rPr>
+          <w:rFonts w:ascii="Times New Roman" w:hAnsi="Times New Roman" w:cs="Times New Roman"/>
+          <w:sz w:val="28"/>
+          <w:szCs w:val="28"/>
+          <w:highlight w:val="yellow"/>
         </w:rPr>
         <w:t>Финальная чистка и структурирование кода</w:t>
       </w:r>

</xml_diff>